<commit_message>
feat: electron version with judge-name store, autocomplete, and live updates
- Electron main: electron-store preferences for judge names, app icon
  resolution, icon.ico bundled via extraResources; preload exposes new IPC
- New API routes: judge-names, prepared-by/names, reports/field-options,
  reports/updates (SSE via lib/sse-broadcast.ts)
- AutocompleteInput component wired into PSIR form sections
- DOCX templates and builders updated (PSIR.docx, TEV.docx, Export_Date,
  conviction dates loop)
- Dashboard/header/sidebar/notification tweaks; electron.d.ts typings
- Add ELECTRON_SYNC_GUIDE.md and ICON_CONVERSION_GUIDE.md
- Bump version to 1.0.1

Co-Authored-By: Claude Fable 5.1 <noreply@anthropic.com>
</commit_message>
<xml_diff>
--- a/templates/PSIR.docx
+++ b/templates/PSIR.docx
@@ -53,7 +53,27 @@
           <w:szCs w:val="24"/>
           <w:lang w:val="en-PH"/>
         </w:rPr>
-        <w:t>{Created_Date}</w:t>
+        <w:t>{</w:t>
+      </w:r>
+      <w:r>
+        <w:rPr>
+          <w:rFonts w:ascii="Arial" w:hAnsi="Arial" w:cs="Arial"/>
+          <w:noProof/>
+          <w:sz w:val="24"/>
+          <w:szCs w:val="24"/>
+          <w:lang w:val="en-PH"/>
+        </w:rPr>
+        <w:t>Export</w:t>
+      </w:r>
+      <w:r>
+        <w:rPr>
+          <w:rFonts w:ascii="Arial" w:hAnsi="Arial" w:cs="Arial"/>
+          <w:noProof/>
+          <w:sz w:val="24"/>
+          <w:szCs w:val="24"/>
+          <w:lang w:val="en-PH"/>
+        </w:rPr>
+        <w:t>_Date}</w:t>
       </w:r>
     </w:p>
     <w:p>
@@ -122,25 +142,7 @@
           <w:sz w:val="24"/>
           <w:szCs w:val="24"/>
         </w:rPr>
-        <w:t>{</w:t>
-      </w:r>
-      <w:proofErr w:type="spellStart"/>
-      <w:r>
-        <w:rPr>
-          <w:rFonts w:ascii="Arial" w:hAnsi="Arial" w:cs="Arial"/>
-          <w:sz w:val="24"/>
-          <w:szCs w:val="24"/>
-        </w:rPr>
-        <w:t>Letter_Position</w:t>
-      </w:r>
-      <w:proofErr w:type="spellEnd"/>
-      <w:r>
-        <w:rPr>
-          <w:rFonts w:ascii="Arial" w:hAnsi="Arial" w:cs="Arial"/>
-          <w:sz w:val="24"/>
-          <w:szCs w:val="24"/>
-        </w:rPr>
-        <w:t>}</w:t>
+        <w:t>{Letter_Position}</w:t>
       </w:r>
     </w:p>
     <w:p>
@@ -180,25 +182,7 @@
           <w:sz w:val="24"/>
           <w:szCs w:val="24"/>
         </w:rPr>
-        <w:t>{</w:t>
-      </w:r>
-      <w:proofErr w:type="spellStart"/>
-      <w:r>
-        <w:rPr>
-          <w:rFonts w:ascii="Arial" w:hAnsi="Arial" w:cs="Arial"/>
-          <w:sz w:val="24"/>
-          <w:szCs w:val="24"/>
-        </w:rPr>
-        <w:t>Letter_Address</w:t>
-      </w:r>
-      <w:proofErr w:type="spellEnd"/>
-      <w:r>
-        <w:rPr>
-          <w:rFonts w:ascii="Arial" w:hAnsi="Arial" w:cs="Arial"/>
-          <w:sz w:val="24"/>
-          <w:szCs w:val="24"/>
-        </w:rPr>
-        <w:t>}</w:t>
+        <w:t>{Letter_Address}</w:t>
       </w:r>
     </w:p>
     <w:p>
@@ -363,29 +347,7 @@
           <w:szCs w:val="24"/>
           <w:lang w:val="en-PH"/>
         </w:rPr>
-        <w:t>{</w:t>
-      </w:r>
-      <w:proofErr w:type="spellStart"/>
-      <w:r>
-        <w:rPr>
-          <w:rFonts w:ascii="Arial" w:hAnsi="Arial" w:cs="Arial"/>
-          <w:b/>
-          <w:sz w:val="24"/>
-          <w:szCs w:val="24"/>
-          <w:lang w:val="en-PH"/>
-        </w:rPr>
-        <w:t>Prepared_By_Name</w:t>
-      </w:r>
-      <w:proofErr w:type="spellEnd"/>
-      <w:r>
-        <w:rPr>
-          <w:rFonts w:ascii="Arial" w:hAnsi="Arial" w:cs="Arial"/>
-          <w:b/>
-          <w:sz w:val="24"/>
-          <w:szCs w:val="24"/>
-          <w:lang w:val="en-PH"/>
-        </w:rPr>
-        <w:t>}</w:t>
+        <w:t>{Prepared_By_Name}</w:t>
       </w:r>
       <w:r>
         <w:rPr>
@@ -610,29 +572,7 @@
           <w:szCs w:val="24"/>
           <w:lang w:val="en-PH"/>
         </w:rPr>
-        <w:t>{</w:t>
-      </w:r>
-      <w:proofErr w:type="spellStart"/>
-      <w:r>
-        <w:rPr>
-          <w:rFonts w:ascii="Arial" w:hAnsi="Arial" w:cs="Arial"/>
-          <w:b/>
-          <w:sz w:val="24"/>
-          <w:szCs w:val="24"/>
-          <w:lang w:val="en-PH"/>
-        </w:rPr>
-        <w:t>Reviewed_By_Name</w:t>
-      </w:r>
-      <w:proofErr w:type="spellEnd"/>
-      <w:r>
-        <w:rPr>
-          <w:rFonts w:ascii="Arial" w:hAnsi="Arial" w:cs="Arial"/>
-          <w:b/>
-          <w:sz w:val="24"/>
-          <w:szCs w:val="24"/>
-          <w:lang w:val="en-PH"/>
-        </w:rPr>
-        <w:t>}</w:t>
+        <w:t>{Reviewed_By_Name}</w:t>
       </w:r>
     </w:p>
     <w:p>
@@ -666,29 +606,7 @@
           <w:szCs w:val="24"/>
           <w:lang w:val="fr-FR"/>
         </w:rPr>
-        <w:t>{</w:t>
-      </w:r>
-      <w:proofErr w:type="spellStart"/>
-      <w:r>
-        <w:rPr>
-          <w:rFonts w:ascii="Arial" w:hAnsi="Arial" w:cs="Arial"/>
-          <w:bCs/>
-          <w:sz w:val="24"/>
-          <w:szCs w:val="24"/>
-          <w:lang w:val="fr-FR"/>
-        </w:rPr>
-        <w:t>Reviewed_By_Designation</w:t>
-      </w:r>
-      <w:proofErr w:type="spellEnd"/>
-      <w:r>
-        <w:rPr>
-          <w:rFonts w:ascii="Arial" w:hAnsi="Arial" w:cs="Arial"/>
-          <w:bCs/>
-          <w:sz w:val="24"/>
-          <w:szCs w:val="24"/>
-          <w:lang w:val="fr-FR"/>
-        </w:rPr>
-        <w:t>}</w:t>
+        <w:t>{Reviewed_By_Designation}</w:t>
       </w:r>
     </w:p>
     <w:p>
@@ -1522,7 +1440,7 @@
                                       <pic:cNvPicPr/>
                                     </pic:nvPicPr>
                                     <pic:blipFill>
-                                      <a:blip r:embed="rId12" cstate="print"/>
+                                      <a:blip r:embed="rId9" cstate="print"/>
                                       <a:srcRect/>
                                       <a:stretch/>
                                     </pic:blipFill>
@@ -1550,7 +1468,7 @@
                           </w:rPr>
                           <w:t xml:space="preserve"> </w:t>
                         </w:r>
-                        <w:hyperlink r:id="rId13" w:history="1">
+                        <w:hyperlink r:id="rId12" w:history="1">
                           <w:r>
                             <w:rPr>
                               <w:rStyle w:val="Hyperlink"/>
@@ -1610,7 +1528,7 @@
                   <o:lock v:ext="edit" aspectratio="t"/>
                 </v:shapetype>
                 <v:shape id="Image" o:spid="_x0000_s1031" type="#_x0000_t75" style="position:absolute;top:4191;width:9239;height:9048;visibility:visible;mso-wrap-style:square" o:gfxdata="UEsDBBQABgAIAAAAIQDb4fbL7gAAAIUBAAATAAAAW0NvbnRlbnRfVHlwZXNdLnhtbHyQz07DMAyH&#10;70i8Q+QralM4IITa7kDhCAiNB7ASt43WOlEcyvb2pNu4IODoPz9/n1xv9vOkForiPDdwXVagiI23&#10;jocG3rdPxR0oScgWJ8/UwIEENu3lRb09BBKV0ywNjCmFe63FjDSjlD4Q50nv44wpl3HQAc0OB9I3&#10;VXWrjedEnIq03oC27qjHjympx31un0wiTQLq4bS4shrAECZnMGVTvbD9QSnOhDInjzsyuiBXWQP0&#10;r4R18jfgnHvJr4nOknrFmJ5xzhraRtHWf3Kkpfz/yGo5S+H73hkquyhdjr3R8m2lj09svwAAAP//&#10;AwBQSwMEFAAGAAgAAAAhAFr0LFu/AAAAFQEAAAsAAABfcmVscy8ucmVsc2zPwWrDMAwG4Ptg72B0&#10;X5TuUMaI01uh19I+gLGVxCy2jGSy9e1nemrHjpL4P0nD4SetZiPRyNnCruvBUPYcYp4tXC/Htw8w&#10;Wl0ObuVMFm6kcBhfX4Yzra62kC6xqGlKVgtLreUTUf1CyWnHhXKbTCzJ1VbKjMX5LzcTvvf9HuXR&#10;gPHJNKdgQU5hB+ZyK23zHztFL6w81c5zQp6m6P9TMfB3PtPWFCczVQtB9N4U2rp2HOA44NMz4y8A&#10;AAD//wMAUEsDBBQABgAIAAAAIQAcUuauxQAAANoAAAAPAAAAZHJzL2Rvd25yZXYueG1sRI9Ba8JA&#10;FITvhf6H5RW81U3FVkndBBEFT9WqCL29Zp9J2uzbmF2T+O9dodDjMDPfMLO0N5VoqXGlZQUvwwgE&#10;cWZ1ybmCw371PAXhPLLGyjIpuJKDNHl8mGGsbcef1O58LgKEXYwKCu/rWEqXFWTQDW1NHLyTbQz6&#10;IJtc6ga7ADeVHEXRmzRYclgosKZFQdnv7mIUnOeb74/T8ScfLydV9LrHr3K7qZUaPPXzdxCeev8f&#10;/muvtYIR3K+EGyCTGwAAAP//AwBQSwECLQAUAAYACAAAACEA2+H2y+4AAACFAQAAEwAAAAAAAAAA&#10;AAAAAAAAAAAAW0NvbnRlbnRfVHlwZXNdLnhtbFBLAQItABQABgAIAAAAIQBa9CxbvwAAABUBAAAL&#10;AAAAAAAAAAAAAAAAAB8BAABfcmVscy8ucmVsc1BLAQItABQABgAIAAAAIQAcUuauxQAAANoAAAAP&#10;AAAAAAAAAAAAAAAAAAcCAABkcnMvZG93bnJldi54bWxQSwUGAAAAAAMAAwC3AAAA+QIAAAAA&#10;">
-                  <v:imagedata r:id="rId14" o:title=""/>
+                  <v:imagedata r:id="rId13" o:title=""/>
                 </v:shape>
               </v:group>
             </w:pict>
@@ -2203,25 +2121,7 @@
                 <w:sz w:val="22"/>
                 <w:szCs w:val="24"/>
               </w:rPr>
-              <w:t>{</w:t>
-            </w:r>
-            <w:proofErr w:type="spellStart"/>
-            <w:r>
-              <w:rPr>
-                <w:rFonts w:ascii="Arial" w:hAnsi="Arial" w:cs="Arial"/>
-                <w:sz w:val="22"/>
-                <w:szCs w:val="24"/>
-              </w:rPr>
-              <w:t>True_Name</w:t>
-            </w:r>
-            <w:proofErr w:type="spellEnd"/>
-            <w:r>
-              <w:rPr>
-                <w:rFonts w:ascii="Arial" w:hAnsi="Arial" w:cs="Arial"/>
-                <w:sz w:val="22"/>
-                <w:szCs w:val="24"/>
-              </w:rPr>
-              <w:t>}</w:t>
+              <w:t>{True_Name}</w:t>
             </w:r>
           </w:p>
         </w:tc>
@@ -2405,25 +2305,7 @@
                 <w:sz w:val="22"/>
                 <w:szCs w:val="24"/>
               </w:rPr>
-              <w:t>{</w:t>
-            </w:r>
-            <w:proofErr w:type="spellStart"/>
-            <w:r>
-              <w:rPr>
-                <w:rFonts w:ascii="Arial" w:hAnsi="Arial" w:cs="Arial"/>
-                <w:sz w:val="22"/>
-                <w:szCs w:val="24"/>
-              </w:rPr>
-              <w:t>Educational_Attainment</w:t>
-            </w:r>
-            <w:proofErr w:type="spellEnd"/>
-            <w:r>
-              <w:rPr>
-                <w:rFonts w:ascii="Arial" w:hAnsi="Arial" w:cs="Arial"/>
-                <w:sz w:val="22"/>
-                <w:szCs w:val="24"/>
-              </w:rPr>
-              <w:t>}</w:t>
+              <w:t>{Educational_Attainment}</w:t>
             </w:r>
           </w:p>
         </w:tc>
@@ -3276,18 +3158,8 @@
                 <w:sz w:val="22"/>
                 <w:szCs w:val="24"/>
               </w:rPr>
-              <w:t>{</w:t>
-            </w:r>
-            <w:proofErr w:type="spellStart"/>
-            <w:r>
-              <w:rPr>
-                <w:rFonts w:ascii="Arial" w:hAnsi="Arial" w:cs="Arial"/>
-                <w:sz w:val="22"/>
-                <w:szCs w:val="24"/>
-              </w:rPr>
-              <w:t>Civil_Status</w:t>
-            </w:r>
-            <w:proofErr w:type="spellEnd"/>
+              <w:t>{Civil_Status</w:t>
+            </w:r>
             <w:r>
               <w:rPr>
                 <w:rFonts w:ascii="Arial" w:hAnsi="Arial" w:cs="Arial"/>
@@ -3471,6 +3343,14 @@
                 <w:szCs w:val="24"/>
               </w:rPr>
             </w:pPr>
+            <w:r>
+              <w:rPr>
+                <w:rFonts w:ascii="Arial" w:hAnsi="Arial" w:cs="Arial"/>
+                <w:sz w:val="22"/>
+                <w:szCs w:val="24"/>
+              </w:rPr>
+              <w:t>{Spouse_Name}</w:t>
+            </w:r>
           </w:p>
         </w:tc>
         <w:tc>
@@ -3626,27 +3506,7 @@
                 <w:sz w:val="22"/>
                 <w:szCs w:val="24"/>
               </w:rPr>
-              <w:t>{</w:t>
-            </w:r>
-            <w:proofErr w:type="spellStart"/>
-            <w:r>
-              <w:rPr>
-                <w:rFonts w:ascii="Arial" w:hAnsi="Arial" w:cs="Arial"/>
-                <w:color w:val="000000" w:themeColor="text1"/>
-                <w:sz w:val="22"/>
-                <w:szCs w:val="24"/>
-              </w:rPr>
-              <w:t>Identifying_Marks</w:t>
-            </w:r>
-            <w:proofErr w:type="spellEnd"/>
-            <w:r>
-              <w:rPr>
-                <w:rFonts w:ascii="Arial" w:hAnsi="Arial" w:cs="Arial"/>
-                <w:color w:val="000000" w:themeColor="text1"/>
-                <w:sz w:val="22"/>
-                <w:szCs w:val="24"/>
-              </w:rPr>
-              <w:t>}</w:t>
+              <w:t>{Identifying_Marks}</w:t>
             </w:r>
           </w:p>
         </w:tc>
@@ -3733,27 +3593,7 @@
                 <w:szCs w:val="24"/>
                 <w:lang w:val="fr-FR"/>
               </w:rPr>
-              <w:t>{</w:t>
-            </w:r>
-            <w:proofErr w:type="spellStart"/>
-            <w:r>
-              <w:rPr>
-                <w:rFonts w:ascii="Arial" w:hAnsi="Arial" w:cs="Arial"/>
-                <w:sz w:val="24"/>
-                <w:szCs w:val="24"/>
-                <w:lang w:val="fr-FR"/>
-              </w:rPr>
-              <w:t>Present_Address</w:t>
-            </w:r>
-            <w:proofErr w:type="spellEnd"/>
-            <w:r>
-              <w:rPr>
-                <w:rFonts w:ascii="Arial" w:hAnsi="Arial" w:cs="Arial"/>
-                <w:sz w:val="24"/>
-                <w:szCs w:val="24"/>
-                <w:lang w:val="fr-FR"/>
-              </w:rPr>
-              <w:t>}</w:t>
+              <w:t>{Present_Address}</w:t>
             </w:r>
           </w:p>
         </w:tc>
@@ -3842,27 +3682,7 @@
                 <w:sz w:val="24"/>
                 <w:szCs w:val="24"/>
               </w:rPr>
-              <w:t>{</w:t>
-            </w:r>
-            <w:proofErr w:type="spellStart"/>
-            <w:r>
-              <w:rPr>
-                <w:rFonts w:ascii="Arial" w:hAnsi="Arial" w:cs="Arial"/>
-                <w:bCs/>
-                <w:sz w:val="24"/>
-                <w:szCs w:val="24"/>
-              </w:rPr>
-              <w:t>Permanent_Address</w:t>
-            </w:r>
-            <w:proofErr w:type="spellEnd"/>
-            <w:r>
-              <w:rPr>
-                <w:rFonts w:ascii="Arial" w:hAnsi="Arial" w:cs="Arial"/>
-                <w:bCs/>
-                <w:sz w:val="24"/>
-                <w:szCs w:val="24"/>
-              </w:rPr>
-              <w:t>}</w:t>
+              <w:t>{Permanent_Address}</w:t>
             </w:r>
           </w:p>
         </w:tc>
@@ -3929,16 +3749,16 @@
         <w:tblLook w:val="0680" w:firstRow="0" w:lastRow="0" w:firstColumn="1" w:lastColumn="0" w:noHBand="1" w:noVBand="1"/>
       </w:tblPr>
       <w:tblGrid>
-        <w:gridCol w:w="1474"/>
+        <w:gridCol w:w="1403"/>
         <w:gridCol w:w="296"/>
-        <w:gridCol w:w="3231"/>
-        <w:gridCol w:w="676"/>
-        <w:gridCol w:w="1704"/>
-        <w:gridCol w:w="248"/>
-        <w:gridCol w:w="815"/>
+        <w:gridCol w:w="4219"/>
+        <w:gridCol w:w="433"/>
+        <w:gridCol w:w="1088"/>
+        <w:gridCol w:w="239"/>
+        <w:gridCol w:w="810"/>
         <w:gridCol w:w="296"/>
-        <w:gridCol w:w="1970"/>
-        <w:gridCol w:w="236"/>
+        <w:gridCol w:w="1956"/>
+        <w:gridCol w:w="206"/>
       </w:tblGrid>
       <w:tr>
         <w:trPr>
@@ -4020,25 +3840,7 @@
                 <w:sz w:val="24"/>
                 <w:szCs w:val="32"/>
               </w:rPr>
-              <w:t>{</w:t>
-            </w:r>
-            <w:proofErr w:type="spellStart"/>
-            <w:r>
-              <w:rPr>
-                <w:rFonts w:ascii="Arial" w:hAnsi="Arial" w:cs="Arial"/>
-                <w:sz w:val="24"/>
-                <w:szCs w:val="32"/>
-              </w:rPr>
-              <w:t>Charged_With</w:t>
-            </w:r>
-            <w:proofErr w:type="spellEnd"/>
-            <w:r>
-              <w:rPr>
-                <w:rFonts w:ascii="Arial" w:hAnsi="Arial" w:cs="Arial"/>
-                <w:sz w:val="24"/>
-                <w:szCs w:val="32"/>
-              </w:rPr>
-              <w:t>}</w:t>
+              <w:t>{Charged_With}</w:t>
             </w:r>
           </w:p>
         </w:tc>
@@ -4135,25 +3937,7 @@
                 <w:sz w:val="22"/>
                 <w:szCs w:val="24"/>
               </w:rPr>
-              <w:t>{</w:t>
-            </w:r>
-            <w:proofErr w:type="spellStart"/>
-            <w:r>
-              <w:rPr>
-                <w:rFonts w:ascii="Arial" w:hAnsi="Arial" w:cs="Arial"/>
-                <w:sz w:val="22"/>
-                <w:szCs w:val="24"/>
-              </w:rPr>
-              <w:t>Charged_Date</w:t>
-            </w:r>
-            <w:proofErr w:type="spellEnd"/>
-            <w:r>
-              <w:rPr>
-                <w:rFonts w:ascii="Arial" w:hAnsi="Arial" w:cs="Arial"/>
-                <w:sz w:val="22"/>
-                <w:szCs w:val="24"/>
-              </w:rPr>
-              <w:t>}</w:t>
+              <w:t>{Charged_Date}</w:t>
             </w:r>
           </w:p>
         </w:tc>
@@ -4238,7 +4022,6 @@
               </w:rPr>
               <w:t>{</w:t>
             </w:r>
-            <w:proofErr w:type="spellStart"/>
             <w:r>
               <w:rPr>
                 <w:rFonts w:ascii="Arial" w:hAnsi="Arial" w:cs="Arial"/>
@@ -4247,7 +4030,6 @@
               </w:rPr>
               <w:t>Convicted_Of</w:t>
             </w:r>
-            <w:proofErr w:type="spellEnd"/>
             <w:r>
               <w:rPr>
                 <w:rFonts w:ascii="Arial" w:hAnsi="Arial" w:cs="Arial"/>
@@ -4344,6 +4126,7 @@
                 <w:rFonts w:ascii="Arial" w:hAnsi="Arial" w:cs="Arial"/>
                 <w:sz w:val="24"/>
                 <w:szCs w:val="24"/>
+                <w:lang w:val="fr-FR"/>
               </w:rPr>
             </w:pPr>
             <w:r>
@@ -4351,26 +4134,9 @@
                 <w:rFonts w:ascii="Arial" w:hAnsi="Arial" w:cs="Arial"/>
                 <w:sz w:val="24"/>
                 <w:szCs w:val="24"/>
-              </w:rPr>
-              <w:t>{</w:t>
-            </w:r>
-            <w:proofErr w:type="spellStart"/>
-            <w:r>
-              <w:rPr>
-                <w:rFonts w:ascii="Arial" w:hAnsi="Arial" w:cs="Arial"/>
-                <w:sz w:val="24"/>
-                <w:szCs w:val="24"/>
-              </w:rPr>
-              <w:t>Convicted_Date</w:t>
-            </w:r>
-            <w:proofErr w:type="spellEnd"/>
-            <w:r>
-              <w:rPr>
-                <w:rFonts w:ascii="Arial" w:hAnsi="Arial" w:cs="Arial"/>
-                <w:sz w:val="24"/>
-                <w:szCs w:val="24"/>
-              </w:rPr>
-              <w:t>}</w:t>
+                <w:lang w:val="fr-FR"/>
+              </w:rPr>
+              <w:t>{Convicted_Date}</w:t>
             </w:r>
           </w:p>
         </w:tc>
@@ -4440,7 +4206,6 @@
               </w:rPr>
               <w:t xml:space="preserve">    </w:t>
             </w:r>
-            <w:proofErr w:type="gramStart"/>
             <w:r>
               <w:rPr>
                 <w:rFonts w:ascii="Arial" w:hAnsi="Arial" w:cs="Arial"/>
@@ -4456,16 +4221,7 @@
                 <w:sz w:val="22"/>
                 <w:szCs w:val="24"/>
               </w:rPr>
-              <w:t>{</w:t>
-            </w:r>
-            <w:proofErr w:type="gramEnd"/>
-            <w:r>
-              <w:rPr>
-                <w:rFonts w:ascii="Arial" w:hAnsi="Arial" w:cs="Arial"/>
-                <w:sz w:val="22"/>
-                <w:szCs w:val="24"/>
-              </w:rPr>
-              <w:t>Sentence}</w:t>
+              <w:t>{Sentence}</w:t>
             </w:r>
           </w:p>
         </w:tc>
@@ -4550,7 +4306,6 @@
               </w:rPr>
               <w:t>{</w:t>
             </w:r>
-            <w:proofErr w:type="spellStart"/>
             <w:r>
               <w:rPr>
                 <w:rFonts w:ascii="Arial" w:hAnsi="Arial" w:cs="Arial"/>
@@ -4565,16 +4320,7 @@
                 <w:sz w:val="22"/>
                 <w:szCs w:val="24"/>
               </w:rPr>
-              <w:t>Judge</w:t>
-            </w:r>
-            <w:proofErr w:type="spellEnd"/>
-            <w:r>
-              <w:rPr>
-                <w:rFonts w:ascii="Arial" w:hAnsi="Arial" w:cs="Arial"/>
-                <w:sz w:val="22"/>
-                <w:szCs w:val="24"/>
-              </w:rPr>
-              <w:t>}</w:t>
+              <w:t>Judge}</w:t>
             </w:r>
           </w:p>
         </w:tc>
@@ -4678,7 +4424,6 @@
               </w:rPr>
               <w:t>{</w:t>
             </w:r>
-            <w:proofErr w:type="spellStart"/>
             <w:r>
               <w:rPr>
                 <w:rFonts w:ascii="Arial" w:hAnsi="Arial" w:cs="Arial"/>
@@ -4693,16 +4438,7 @@
                 <w:sz w:val="24"/>
                 <w:szCs w:val="24"/>
               </w:rPr>
-              <w:t>Court</w:t>
-            </w:r>
-            <w:proofErr w:type="spellEnd"/>
-            <w:r>
-              <w:rPr>
-                <w:rFonts w:ascii="Arial" w:hAnsi="Arial" w:cs="Arial"/>
-                <w:sz w:val="24"/>
-                <w:szCs w:val="24"/>
-              </w:rPr>
-              <w:t>}</w:t>
+              <w:t>Court}</w:t>
             </w:r>
           </w:p>
         </w:tc>
@@ -4785,118 +4521,33 @@
                 <w:sz w:val="22"/>
                 <w:szCs w:val="22"/>
               </w:rPr>
-              <w:t>{</w:t>
-            </w:r>
-            <w:proofErr w:type="spellStart"/>
-            <w:r>
-              <w:rPr>
-                <w:rFonts w:ascii="Arial" w:hAnsi="Arial" w:cs="Arial"/>
-                <w:sz w:val="22"/>
-                <w:szCs w:val="22"/>
-              </w:rPr>
-              <w:t>Custodial_On_</w:t>
-            </w:r>
-            <w:proofErr w:type="gramStart"/>
-            <w:r>
-              <w:rPr>
-                <w:rFonts w:ascii="Arial" w:hAnsi="Arial" w:cs="Arial"/>
-                <w:sz w:val="22"/>
-                <w:szCs w:val="22"/>
-              </w:rPr>
-              <w:t>Bail</w:t>
-            </w:r>
-            <w:proofErr w:type="spellEnd"/>
-            <w:r>
-              <w:rPr>
-                <w:rFonts w:ascii="Arial" w:hAnsi="Arial" w:cs="Arial"/>
-                <w:sz w:val="22"/>
-                <w:szCs w:val="22"/>
-              </w:rPr>
-              <w:t>}</w:t>
-            </w:r>
-            <w:r>
-              <w:rPr>
-                <w:rFonts w:ascii="Arial" w:hAnsi="Arial" w:cs="Arial"/>
-                <w:sz w:val="22"/>
-                <w:szCs w:val="22"/>
-                <w:lang w:val="en-PH" w:eastAsia="en-PH"/>
-              </w:rPr>
-              <w:t>On</w:t>
-            </w:r>
-            <w:proofErr w:type="gramEnd"/>
-            <w:r>
-              <w:rPr>
-                <w:rFonts w:ascii="Arial" w:hAnsi="Arial" w:cs="Arial"/>
-                <w:sz w:val="22"/>
-                <w:szCs w:val="22"/>
-                <w:lang w:val="en-PH" w:eastAsia="en-PH"/>
-              </w:rPr>
-              <w:t xml:space="preserve"> Bail</w:t>
-            </w:r>
-            <w:proofErr w:type="gramStart"/>
-            <w:r>
-              <w:rPr>
-                <w:rFonts w:ascii="Arial" w:hAnsi="Arial" w:cs="Arial"/>
-                <w:sz w:val="22"/>
-                <w:szCs w:val="22"/>
-                <w:lang w:val="en-PH" w:eastAsia="en-PH"/>
-              </w:rPr>
-              <w:t xml:space="preserve">   </w:t>
-            </w:r>
-            <w:r>
-              <w:rPr>
-                <w:rFonts w:ascii="Arial" w:hAnsi="Arial" w:cs="Arial"/>
-                <w:sz w:val="22"/>
-                <w:szCs w:val="22"/>
-              </w:rPr>
-              <w:t>{</w:t>
-            </w:r>
-            <w:proofErr w:type="spellStart"/>
-            <w:proofErr w:type="gramEnd"/>
-            <w:r>
-              <w:rPr>
-                <w:rFonts w:ascii="Arial" w:hAnsi="Arial" w:cs="Arial"/>
-                <w:sz w:val="22"/>
-                <w:szCs w:val="22"/>
-              </w:rPr>
-              <w:t>Custodial_On_</w:t>
-            </w:r>
-            <w:proofErr w:type="gramStart"/>
-            <w:r>
-              <w:rPr>
-                <w:rFonts w:ascii="Arial" w:hAnsi="Arial" w:cs="Arial"/>
-                <w:sz w:val="22"/>
-                <w:szCs w:val="22"/>
-              </w:rPr>
-              <w:t>Detention</w:t>
-            </w:r>
-            <w:proofErr w:type="spellEnd"/>
-            <w:r>
-              <w:rPr>
-                <w:rFonts w:ascii="Arial" w:hAnsi="Arial" w:cs="Arial"/>
-                <w:sz w:val="22"/>
-                <w:szCs w:val="22"/>
-              </w:rPr>
-              <w:t>}</w:t>
-            </w:r>
-            <w:r>
-              <w:rPr>
-                <w:rFonts w:ascii="Arial" w:hAnsi="Arial" w:cs="Arial"/>
-                <w:sz w:val="22"/>
-                <w:szCs w:val="22"/>
-                <w:lang w:val="en-PH" w:eastAsia="en-PH"/>
-              </w:rPr>
-              <w:t>On</w:t>
-            </w:r>
-            <w:proofErr w:type="gramEnd"/>
-            <w:r>
-              <w:rPr>
-                <w:rFonts w:ascii="Arial" w:hAnsi="Arial" w:cs="Arial"/>
-                <w:sz w:val="22"/>
-                <w:szCs w:val="22"/>
-                <w:lang w:val="en-PH" w:eastAsia="en-PH"/>
-              </w:rPr>
-              <w:t xml:space="preserve"> Detention</w:t>
+              <w:t>{Custodial_On_Bail}</w:t>
+            </w:r>
+            <w:r>
+              <w:rPr>
+                <w:rFonts w:ascii="Arial" w:hAnsi="Arial" w:cs="Arial"/>
+                <w:sz w:val="22"/>
+                <w:szCs w:val="22"/>
+                <w:lang w:val="en-PH" w:eastAsia="en-PH"/>
+              </w:rPr>
+              <w:t xml:space="preserve">On Bail   </w:t>
+            </w:r>
+            <w:r>
+              <w:rPr>
+                <w:rFonts w:ascii="Arial" w:hAnsi="Arial" w:cs="Arial"/>
+                <w:sz w:val="22"/>
+                <w:szCs w:val="22"/>
+              </w:rPr>
+              <w:t>{Custodial_On_Detention}</w:t>
+            </w:r>
+            <w:r>
+              <w:rPr>
+                <w:rFonts w:ascii="Arial" w:hAnsi="Arial" w:cs="Arial"/>
+                <w:sz w:val="22"/>
+                <w:szCs w:val="22"/>
+                <w:lang w:val="en-PH" w:eastAsia="en-PH"/>
+              </w:rPr>
+              <w:t>On Detention</w:t>
             </w:r>
           </w:p>
         </w:tc>
@@ -4962,27 +4613,7 @@
                 <w:szCs w:val="22"/>
                 <w:lang w:val="fr-FR" w:eastAsia="en-PH"/>
               </w:rPr>
-              <w:t>{</w:t>
-            </w:r>
-            <w:proofErr w:type="spellStart"/>
-            <w:r>
-              <w:rPr>
-                <w:rFonts w:ascii="Arial" w:hAnsi="Arial" w:cs="Arial"/>
-                <w:sz w:val="22"/>
-                <w:szCs w:val="22"/>
-                <w:lang w:val="fr-FR" w:eastAsia="en-PH"/>
-              </w:rPr>
-              <w:t>Custodial_ROR</w:t>
-            </w:r>
-            <w:proofErr w:type="spellEnd"/>
-            <w:r>
-              <w:rPr>
-                <w:rFonts w:ascii="Arial" w:hAnsi="Arial" w:cs="Arial"/>
-                <w:sz w:val="22"/>
-                <w:szCs w:val="22"/>
-                <w:lang w:val="fr-FR" w:eastAsia="en-PH"/>
-              </w:rPr>
-              <w:t>}</w:t>
+              <w:t>{Custodial_ROR}</w:t>
             </w:r>
           </w:p>
           <w:p>
@@ -5031,9 +4662,8 @@
                 <w:u w:val="single"/>
                 <w:lang w:val="en-PH" w:eastAsia="en-PH"/>
               </w:rPr>
-              <w:t>{</w:t>
-            </w:r>
-            <w:proofErr w:type="spellStart"/>
+              <w:t>{ROR_Custodian}</w:t>
+            </w:r>
             <w:r>
               <w:rPr>
                 <w:rFonts w:ascii="Arial" w:hAnsi="Arial" w:cs="Arial"/>
@@ -5042,9 +4672,28 @@
                 <w:u w:val="single"/>
                 <w:lang w:val="en-PH" w:eastAsia="en-PH"/>
               </w:rPr>
-              <w:t>ROR_Custodian</w:t>
-            </w:r>
-            <w:proofErr w:type="spellEnd"/>
+              <w:t xml:space="preserve">, </w:t>
+            </w:r>
+            <w:r>
+              <w:rPr>
+                <w:rFonts w:ascii="Arial" w:hAnsi="Arial" w:cs="Arial"/>
+                <w:sz w:val="22"/>
+                <w:szCs w:val="22"/>
+                <w:u w:val="single"/>
+                <w:lang w:val="en-PH" w:eastAsia="en-PH"/>
+              </w:rPr>
+              <w:t>{ROR_Custodian</w:t>
+            </w:r>
+            <w:r>
+              <w:rPr>
+                <w:rFonts w:ascii="Arial" w:hAnsi="Arial" w:cs="Arial"/>
+                <w:sz w:val="22"/>
+                <w:szCs w:val="22"/>
+                <w:u w:val="single"/>
+                <w:lang w:val="en-PH" w:eastAsia="en-PH"/>
+              </w:rPr>
+              <w:t>2</w:t>
+            </w:r>
             <w:r>
               <w:rPr>
                 <w:rFonts w:ascii="Arial" w:hAnsi="Arial" w:cs="Arial"/>
@@ -5110,7 +4759,6 @@
                 <w:szCs w:val="24"/>
               </w:rPr>
             </w:pPr>
-            <w:proofErr w:type="gramStart"/>
             <w:r>
               <w:rPr>
                 <w:rFonts w:ascii="Arial" w:hAnsi="Arial" w:cs="Arial"/>
@@ -5127,15 +4775,13 @@
               </w:rPr>
               <w:t>{</w:t>
             </w:r>
-            <w:proofErr w:type="spellStart"/>
-            <w:proofErr w:type="gramEnd"/>
             <w:r>
               <w:rPr>
                 <w:rFonts w:ascii="Arial" w:hAnsi="Arial" w:cs="Arial"/>
                 <w:sz w:val="24"/>
                 <w:szCs w:val="24"/>
               </w:rPr>
-              <w:t>Complet</w:t>
+              <w:t>ROR_Custodian2_Address</w:t>
             </w:r>
             <w:r>
               <w:rPr>
@@ -5143,35 +4789,16 @@
                 <w:sz w:val="24"/>
                 <w:szCs w:val="24"/>
               </w:rPr>
-              <w:t>e_</w:t>
-            </w:r>
-            <w:proofErr w:type="gramStart"/>
+              <w:t>}</w:t>
+            </w:r>
             <w:r>
               <w:rPr>
                 <w:rFonts w:ascii="Arial" w:hAnsi="Arial" w:cs="Arial"/>
                 <w:sz w:val="24"/>
                 <w:szCs w:val="24"/>
               </w:rPr>
-              <w:t>Adress</w:t>
-            </w:r>
-            <w:proofErr w:type="spellEnd"/>
-            <w:r>
-              <w:rPr>
-                <w:rFonts w:ascii="Arial" w:hAnsi="Arial" w:cs="Arial"/>
-                <w:sz w:val="24"/>
-                <w:szCs w:val="24"/>
-              </w:rPr>
-              <w:t>}</w:t>
-            </w:r>
-            <w:r>
-              <w:rPr>
-                <w:rFonts w:ascii="Arial" w:hAnsi="Arial" w:cs="Arial"/>
-                <w:sz w:val="24"/>
-                <w:szCs w:val="24"/>
-              </w:rPr>
               <w:t xml:space="preserve">   </w:t>
             </w:r>
-            <w:proofErr w:type="gramEnd"/>
           </w:p>
         </w:tc>
         <w:tc>
@@ -5470,23 +5097,7 @@
                 <w:rFonts w:ascii="Arial" w:hAnsi="Arial" w:cs="Arial"/>
                 <w:szCs w:val="24"/>
               </w:rPr>
-              <w:t>{</w:t>
-            </w:r>
-            <w:proofErr w:type="spellStart"/>
-            <w:r>
-              <w:rPr>
-                <w:rFonts w:ascii="Arial" w:hAnsi="Arial" w:cs="Arial"/>
-                <w:szCs w:val="24"/>
-              </w:rPr>
-              <w:t>NBI_Case_Number</w:t>
-            </w:r>
-            <w:proofErr w:type="spellEnd"/>
-            <w:r>
-              <w:rPr>
-                <w:rFonts w:ascii="Arial" w:hAnsi="Arial" w:cs="Arial"/>
-                <w:szCs w:val="24"/>
-              </w:rPr>
-              <w:t>}</w:t>
+              <w:t>{NBI_Case_Number}</w:t>
             </w:r>
           </w:p>
         </w:tc>
@@ -5508,23 +5119,7 @@
                 <w:rFonts w:ascii="Arial" w:hAnsi="Arial" w:cs="Arial"/>
                 <w:szCs w:val="24"/>
               </w:rPr>
-              <w:t>{</w:t>
-            </w:r>
-            <w:proofErr w:type="spellStart"/>
-            <w:r>
-              <w:rPr>
-                <w:rFonts w:ascii="Arial" w:hAnsi="Arial" w:cs="Arial"/>
-                <w:szCs w:val="24"/>
-              </w:rPr>
-              <w:t>NBI_Offense</w:t>
-            </w:r>
-            <w:proofErr w:type="spellEnd"/>
-            <w:r>
-              <w:rPr>
-                <w:rFonts w:ascii="Arial" w:hAnsi="Arial" w:cs="Arial"/>
-                <w:szCs w:val="24"/>
-              </w:rPr>
-              <w:t>}</w:t>
+              <w:t>{NBI_Offense}</w:t>
             </w:r>
           </w:p>
         </w:tc>
@@ -5546,23 +5141,7 @@
                 <w:rFonts w:ascii="Arial" w:hAnsi="Arial" w:cs="Arial"/>
                 <w:szCs w:val="24"/>
               </w:rPr>
-              <w:t>{</w:t>
-            </w:r>
-            <w:proofErr w:type="spellStart"/>
-            <w:r>
-              <w:rPr>
-                <w:rFonts w:ascii="Arial" w:hAnsi="Arial" w:cs="Arial"/>
-                <w:szCs w:val="24"/>
-              </w:rPr>
-              <w:t>NBI_Date_Charged</w:t>
-            </w:r>
-            <w:proofErr w:type="spellEnd"/>
-            <w:r>
-              <w:rPr>
-                <w:rFonts w:ascii="Arial" w:hAnsi="Arial" w:cs="Arial"/>
-                <w:szCs w:val="24"/>
-              </w:rPr>
-              <w:t>}</w:t>
+              <w:t>{NBI_Date_Charged}</w:t>
             </w:r>
           </w:p>
         </w:tc>
@@ -5584,23 +5163,7 @@
                 <w:rFonts w:ascii="Arial" w:hAnsi="Arial" w:cs="Arial"/>
                 <w:szCs w:val="24"/>
               </w:rPr>
-              <w:t>{</w:t>
-            </w:r>
-            <w:proofErr w:type="spellStart"/>
-            <w:r>
-              <w:rPr>
-                <w:rFonts w:ascii="Arial" w:hAnsi="Arial" w:cs="Arial"/>
-                <w:szCs w:val="24"/>
-              </w:rPr>
-              <w:t>NBI_Decision_Status</w:t>
-            </w:r>
-            <w:proofErr w:type="spellEnd"/>
-            <w:r>
-              <w:rPr>
-                <w:rFonts w:ascii="Arial" w:hAnsi="Arial" w:cs="Arial"/>
-                <w:szCs w:val="24"/>
-              </w:rPr>
-              <w:t>}</w:t>
+              <w:t>{NBI_Decision_Status}</w:t>
             </w:r>
           </w:p>
         </w:tc>
@@ -5647,23 +5210,7 @@
                 <w:rFonts w:ascii="Arial" w:hAnsi="Arial" w:cs="Arial"/>
                 <w:szCs w:val="24"/>
               </w:rPr>
-              <w:t>{</w:t>
-            </w:r>
-            <w:proofErr w:type="spellStart"/>
-            <w:r>
-              <w:rPr>
-                <w:rFonts w:ascii="Arial" w:hAnsi="Arial" w:cs="Arial"/>
-                <w:szCs w:val="24"/>
-              </w:rPr>
-              <w:t>CMRD_Case_Number</w:t>
-            </w:r>
-            <w:proofErr w:type="spellEnd"/>
-            <w:r>
-              <w:rPr>
-                <w:rFonts w:ascii="Arial" w:hAnsi="Arial" w:cs="Arial"/>
-                <w:szCs w:val="24"/>
-              </w:rPr>
-              <w:t>}</w:t>
+              <w:t>{CMRD_Case_Number}</w:t>
             </w:r>
           </w:p>
         </w:tc>
@@ -5685,23 +5232,7 @@
                 <w:rFonts w:ascii="Arial" w:hAnsi="Arial" w:cs="Arial"/>
                 <w:szCs w:val="24"/>
               </w:rPr>
-              <w:t>{</w:t>
-            </w:r>
-            <w:proofErr w:type="spellStart"/>
-            <w:r>
-              <w:rPr>
-                <w:rFonts w:ascii="Arial" w:hAnsi="Arial" w:cs="Arial"/>
-                <w:szCs w:val="24"/>
-              </w:rPr>
-              <w:t>CMRD_Offense</w:t>
-            </w:r>
-            <w:proofErr w:type="spellEnd"/>
-            <w:r>
-              <w:rPr>
-                <w:rFonts w:ascii="Arial" w:hAnsi="Arial" w:cs="Arial"/>
-                <w:szCs w:val="24"/>
-              </w:rPr>
-              <w:t>}</w:t>
+              <w:t>{CMRD_Offense}</w:t>
             </w:r>
           </w:p>
         </w:tc>
@@ -5723,23 +5254,7 @@
                 <w:rFonts w:ascii="Arial" w:hAnsi="Arial" w:cs="Arial"/>
                 <w:szCs w:val="24"/>
               </w:rPr>
-              <w:t>{</w:t>
-            </w:r>
-            <w:proofErr w:type="spellStart"/>
-            <w:r>
-              <w:rPr>
-                <w:rFonts w:ascii="Arial" w:hAnsi="Arial" w:cs="Arial"/>
-                <w:szCs w:val="24"/>
-              </w:rPr>
-              <w:t>CMRD_Date_Charged</w:t>
-            </w:r>
-            <w:proofErr w:type="spellEnd"/>
-            <w:r>
-              <w:rPr>
-                <w:rFonts w:ascii="Arial" w:hAnsi="Arial" w:cs="Arial"/>
-                <w:szCs w:val="24"/>
-              </w:rPr>
-              <w:t>}</w:t>
+              <w:t>{CMRD_Date_Charged}</w:t>
             </w:r>
           </w:p>
         </w:tc>
@@ -5761,23 +5276,7 @@
                 <w:rFonts w:ascii="Arial" w:hAnsi="Arial" w:cs="Arial"/>
                 <w:szCs w:val="24"/>
               </w:rPr>
-              <w:t>{</w:t>
-            </w:r>
-            <w:proofErr w:type="spellStart"/>
-            <w:r>
-              <w:rPr>
-                <w:rFonts w:ascii="Arial" w:hAnsi="Arial" w:cs="Arial"/>
-                <w:szCs w:val="24"/>
-              </w:rPr>
-              <w:t>CMRD_Decision_Status</w:t>
-            </w:r>
-            <w:proofErr w:type="spellEnd"/>
-            <w:r>
-              <w:rPr>
-                <w:rFonts w:ascii="Arial" w:hAnsi="Arial" w:cs="Arial"/>
-                <w:szCs w:val="24"/>
-              </w:rPr>
-              <w:t>}</w:t>
+              <w:t>{CMRD_Decision_Status}</w:t>
             </w:r>
           </w:p>
         </w:tc>
@@ -5827,23 +5326,7 @@
                 <w:rFonts w:ascii="Arial" w:hAnsi="Arial" w:cs="Arial"/>
                 <w:szCs w:val="24"/>
               </w:rPr>
-              <w:t>{</w:t>
-            </w:r>
-            <w:proofErr w:type="spellStart"/>
-            <w:r>
-              <w:rPr>
-                <w:rFonts w:ascii="Arial" w:hAnsi="Arial" w:cs="Arial"/>
-                <w:szCs w:val="24"/>
-              </w:rPr>
-              <w:t>Others_Case_Number</w:t>
-            </w:r>
-            <w:proofErr w:type="spellEnd"/>
-            <w:r>
-              <w:rPr>
-                <w:rFonts w:ascii="Arial" w:hAnsi="Arial" w:cs="Arial"/>
-                <w:szCs w:val="24"/>
-              </w:rPr>
-              <w:t>}</w:t>
+              <w:t>{Others_Case_Number}</w:t>
             </w:r>
           </w:p>
         </w:tc>
@@ -5865,23 +5348,7 @@
                 <w:rFonts w:ascii="Arial" w:hAnsi="Arial" w:cs="Arial"/>
                 <w:szCs w:val="24"/>
               </w:rPr>
-              <w:t>{</w:t>
-            </w:r>
-            <w:proofErr w:type="spellStart"/>
-            <w:r>
-              <w:rPr>
-                <w:rFonts w:ascii="Arial" w:hAnsi="Arial" w:cs="Arial"/>
-                <w:szCs w:val="24"/>
-              </w:rPr>
-              <w:t>Others_Offense</w:t>
-            </w:r>
-            <w:proofErr w:type="spellEnd"/>
-            <w:r>
-              <w:rPr>
-                <w:rFonts w:ascii="Arial" w:hAnsi="Arial" w:cs="Arial"/>
-                <w:szCs w:val="24"/>
-              </w:rPr>
-              <w:t>}</w:t>
+              <w:t>{Others_Offense}</w:t>
             </w:r>
           </w:p>
         </w:tc>
@@ -5903,23 +5370,7 @@
                 <w:rFonts w:ascii="Arial" w:hAnsi="Arial" w:cs="Arial"/>
                 <w:szCs w:val="24"/>
               </w:rPr>
-              <w:t>{</w:t>
-            </w:r>
-            <w:proofErr w:type="spellStart"/>
-            <w:r>
-              <w:rPr>
-                <w:rFonts w:ascii="Arial" w:hAnsi="Arial" w:cs="Arial"/>
-                <w:szCs w:val="24"/>
-              </w:rPr>
-              <w:t>Others_Date_Charged</w:t>
-            </w:r>
-            <w:proofErr w:type="spellEnd"/>
-            <w:r>
-              <w:rPr>
-                <w:rFonts w:ascii="Arial" w:hAnsi="Arial" w:cs="Arial"/>
-                <w:szCs w:val="24"/>
-              </w:rPr>
-              <w:t>}</w:t>
+              <w:t>{Others_Date_Charged}</w:t>
             </w:r>
           </w:p>
         </w:tc>
@@ -5941,23 +5392,7 @@
                 <w:rFonts w:ascii="Arial" w:hAnsi="Arial" w:cs="Arial"/>
                 <w:szCs w:val="24"/>
               </w:rPr>
-              <w:t>{</w:t>
-            </w:r>
-            <w:proofErr w:type="spellStart"/>
-            <w:r>
-              <w:rPr>
-                <w:rFonts w:ascii="Arial" w:hAnsi="Arial" w:cs="Arial"/>
-                <w:szCs w:val="24"/>
-              </w:rPr>
-              <w:t>Others_Decision_Status</w:t>
-            </w:r>
-            <w:proofErr w:type="spellEnd"/>
-            <w:r>
-              <w:rPr>
-                <w:rFonts w:ascii="Arial" w:hAnsi="Arial" w:cs="Arial"/>
-                <w:szCs w:val="24"/>
-              </w:rPr>
-              <w:t>}</w:t>
+              <w:t>{Others_Decision_Status}</w:t>
             </w:r>
           </w:p>
         </w:tc>
@@ -5982,47 +5417,7 @@
           <w:sz w:val="18"/>
           <w:szCs w:val="26"/>
         </w:rPr>
-        <w:t xml:space="preserve">The Office reserves the right to submit supplemental report once records verification from the institution and/or law-enforcement agencies yields derogatory result or previous criminal records. Also attach the </w:t>
-      </w:r>
-      <w:proofErr w:type="spellStart"/>
-      <w:r>
-        <w:rPr>
-          <w:rFonts w:ascii="Arial" w:hAnsi="Arial" w:cs="Arial"/>
-          <w:i/>
-          <w:sz w:val="18"/>
-          <w:szCs w:val="26"/>
-        </w:rPr>
-        <w:t>Sinumpaang</w:t>
-      </w:r>
-      <w:proofErr w:type="spellEnd"/>
-      <w:r>
-        <w:rPr>
-          <w:rFonts w:ascii="Arial" w:hAnsi="Arial" w:cs="Arial"/>
-          <w:i/>
-          <w:sz w:val="18"/>
-          <w:szCs w:val="26"/>
-        </w:rPr>
-        <w:t xml:space="preserve"> </w:t>
-      </w:r>
-      <w:proofErr w:type="spellStart"/>
-      <w:r>
-        <w:rPr>
-          <w:rFonts w:ascii="Arial" w:hAnsi="Arial" w:cs="Arial"/>
-          <w:i/>
-          <w:sz w:val="18"/>
-          <w:szCs w:val="26"/>
-        </w:rPr>
-        <w:t>Salaysay</w:t>
-      </w:r>
-      <w:proofErr w:type="spellEnd"/>
-      <w:r>
-        <w:rPr>
-          <w:rFonts w:ascii="Arial" w:hAnsi="Arial" w:cs="Arial"/>
-          <w:i/>
-          <w:sz w:val="18"/>
-          <w:szCs w:val="26"/>
-        </w:rPr>
-        <w:t xml:space="preserve">. </w:t>
+        <w:t xml:space="preserve">The Office reserves the right to submit supplemental report once records verification from the institution and/or law-enforcement agencies yields derogatory result or previous criminal records. Also attach the Sinumpaang Salaysay. </w:t>
       </w:r>
     </w:p>
     <w:p>
@@ -6804,27 +6199,7 @@
                 <w:szCs w:val="22"/>
                 <w:lang w:val="en-PH" w:eastAsia="en-PH"/>
               </w:rPr>
-              <w:t>{</w:t>
-            </w:r>
-            <w:proofErr w:type="spellStart"/>
-            <w:r>
-              <w:rPr>
-                <w:rFonts w:ascii="Arial" w:hAnsi="Arial" w:cs="Arial"/>
-                <w:sz w:val="22"/>
-                <w:szCs w:val="22"/>
-                <w:lang w:val="en-PH" w:eastAsia="en-PH"/>
-              </w:rPr>
-              <w:t>Status_Poor</w:t>
-            </w:r>
-            <w:proofErr w:type="spellEnd"/>
-            <w:r>
-              <w:rPr>
-                <w:rFonts w:ascii="Arial" w:hAnsi="Arial" w:cs="Arial"/>
-                <w:sz w:val="22"/>
-                <w:szCs w:val="22"/>
-                <w:lang w:val="en-PH" w:eastAsia="en-PH"/>
-              </w:rPr>
-              <w:t>}</w:t>
+              <w:t>{Status_Poor}</w:t>
             </w:r>
             <w:r>
               <w:rPr>
@@ -6920,27 +6295,7 @@
                 <w:szCs w:val="22"/>
                 <w:lang w:val="en-PH" w:eastAsia="en-PH"/>
               </w:rPr>
-              <w:t>{</w:t>
-            </w:r>
-            <w:proofErr w:type="spellStart"/>
-            <w:r>
-              <w:rPr>
-                <w:rFonts w:ascii="Arial" w:hAnsi="Arial" w:cs="Arial"/>
-                <w:sz w:val="22"/>
-                <w:szCs w:val="22"/>
-                <w:lang w:val="en-PH" w:eastAsia="en-PH"/>
-              </w:rPr>
-              <w:t>Relationship_Very_Satisfactory</w:t>
-            </w:r>
-            <w:proofErr w:type="spellEnd"/>
-            <w:r>
-              <w:rPr>
-                <w:rFonts w:ascii="Arial" w:hAnsi="Arial" w:cs="Arial"/>
-                <w:sz w:val="22"/>
-                <w:szCs w:val="22"/>
-                <w:lang w:val="en-PH" w:eastAsia="en-PH"/>
-              </w:rPr>
-              <w:t>}</w:t>
+              <w:t>{Relationship_Very_Satisfactory}</w:t>
             </w:r>
             <w:r>
               <w:rPr>
@@ -7036,27 +6391,7 @@
                 <w:szCs w:val="22"/>
                 <w:lang w:val="en-PH" w:eastAsia="en-PH"/>
               </w:rPr>
-              <w:t>{</w:t>
-            </w:r>
-            <w:proofErr w:type="spellStart"/>
-            <w:r>
-              <w:rPr>
-                <w:rFonts w:ascii="Arial" w:hAnsi="Arial" w:cs="Arial"/>
-                <w:sz w:val="22"/>
-                <w:szCs w:val="22"/>
-                <w:lang w:val="en-PH" w:eastAsia="en-PH"/>
-              </w:rPr>
-              <w:t>Reputation_Very_Satisfactory</w:t>
-            </w:r>
-            <w:proofErr w:type="spellEnd"/>
-            <w:r>
-              <w:rPr>
-                <w:rFonts w:ascii="Arial" w:hAnsi="Arial" w:cs="Arial"/>
-                <w:sz w:val="22"/>
-                <w:szCs w:val="22"/>
-                <w:lang w:val="en-PH" w:eastAsia="en-PH"/>
-              </w:rPr>
-              <w:t>}</w:t>
+              <w:t>{Reputation_Very_Satisfactory}</w:t>
             </w:r>
             <w:r>
               <w:rPr>
@@ -7182,38 +6517,17 @@
                 <w:szCs w:val="22"/>
                 <w:lang w:val="en-PH" w:eastAsia="en-PH"/>
               </w:rPr>
-              <w:t>{</w:t>
-            </w:r>
-            <w:proofErr w:type="spellStart"/>
-            <w:r>
-              <w:rPr>
-                <w:rFonts w:ascii="Arial" w:hAnsi="Arial" w:cs="Arial"/>
-                <w:sz w:val="22"/>
-                <w:szCs w:val="22"/>
-                <w:lang w:val="en-PH" w:eastAsia="en-PH"/>
-              </w:rPr>
-              <w:t>Status_</w:t>
-            </w:r>
-            <w:r>
-              <w:rPr>
-                <w:rFonts w:ascii="Arial" w:hAnsi="Arial" w:cs="Arial"/>
-                <w:sz w:val="22"/>
-                <w:szCs w:val="22"/>
-                <w:lang w:val="en-PH" w:eastAsia="en-PH"/>
-              </w:rPr>
-              <w:t>Low_</w:t>
-            </w:r>
-            <w:proofErr w:type="gramStart"/>
-            <w:r>
-              <w:rPr>
-                <w:rFonts w:ascii="Arial" w:hAnsi="Arial" w:cs="Arial"/>
-                <w:sz w:val="22"/>
-                <w:szCs w:val="22"/>
-                <w:lang w:val="en-PH" w:eastAsia="en-PH"/>
-              </w:rPr>
-              <w:t>Income</w:t>
-            </w:r>
-            <w:proofErr w:type="spellEnd"/>
+              <w:t>{Status_</w:t>
+            </w:r>
+            <w:r>
+              <w:rPr>
+                <w:rFonts w:ascii="Arial" w:hAnsi="Arial" w:cs="Arial"/>
+                <w:sz w:val="22"/>
+                <w:szCs w:val="22"/>
+                <w:lang w:val="en-PH" w:eastAsia="en-PH"/>
+              </w:rPr>
+              <w:t>Low_Income</w:t>
+            </w:r>
             <w:r>
               <w:rPr>
                 <w:rFonts w:ascii="Arial" w:hAnsi="Arial" w:cs="Arial"/>
@@ -7230,17 +6544,7 @@
                 <w:szCs w:val="22"/>
                 <w:lang w:val="en-PH" w:eastAsia="en-PH"/>
               </w:rPr>
-              <w:t>Low</w:t>
-            </w:r>
-            <w:proofErr w:type="gramEnd"/>
-            <w:r>
-              <w:rPr>
-                <w:rFonts w:ascii="Arial" w:hAnsi="Arial" w:cs="Arial"/>
-                <w:sz w:val="22"/>
-                <w:szCs w:val="22"/>
-                <w:lang w:val="en-PH" w:eastAsia="en-PH"/>
-              </w:rPr>
-              <w:t xml:space="preserve">-income Class (but </w:t>
+              <w:t xml:space="preserve">Low-income Class (but </w:t>
             </w:r>
           </w:p>
           <w:p>
@@ -7347,27 +6651,7 @@
                 <w:szCs w:val="22"/>
                 <w:lang w:val="en-PH" w:eastAsia="en-PH"/>
               </w:rPr>
-              <w:t>{</w:t>
-            </w:r>
-            <w:proofErr w:type="spellStart"/>
-            <w:r>
-              <w:rPr>
-                <w:rFonts w:ascii="Arial" w:hAnsi="Arial" w:cs="Arial"/>
-                <w:sz w:val="22"/>
-                <w:szCs w:val="22"/>
-                <w:lang w:val="en-PH" w:eastAsia="en-PH"/>
-              </w:rPr>
-              <w:t>Relationship_Satisfactory</w:t>
-            </w:r>
-            <w:proofErr w:type="spellEnd"/>
-            <w:r>
-              <w:rPr>
-                <w:rFonts w:ascii="Arial" w:hAnsi="Arial" w:cs="Arial"/>
-                <w:sz w:val="22"/>
-                <w:szCs w:val="22"/>
-                <w:lang w:val="en-PH" w:eastAsia="en-PH"/>
-              </w:rPr>
-              <w:t>}</w:t>
+              <w:t>{Relationship_Satisfactory}</w:t>
             </w:r>
             <w:r>
               <w:rPr>
@@ -7462,27 +6746,7 @@
                 <w:szCs w:val="22"/>
                 <w:lang w:val="en-PH" w:eastAsia="en-PH"/>
               </w:rPr>
-              <w:t>{</w:t>
-            </w:r>
-            <w:proofErr w:type="spellStart"/>
-            <w:r>
-              <w:rPr>
-                <w:rFonts w:ascii="Arial" w:hAnsi="Arial" w:cs="Arial"/>
-                <w:sz w:val="22"/>
-                <w:szCs w:val="22"/>
-                <w:lang w:val="en-PH" w:eastAsia="en-PH"/>
-              </w:rPr>
-              <w:t>Reputation_Satisfactory</w:t>
-            </w:r>
-            <w:proofErr w:type="spellEnd"/>
-            <w:r>
-              <w:rPr>
-                <w:rFonts w:ascii="Arial" w:hAnsi="Arial" w:cs="Arial"/>
-                <w:sz w:val="22"/>
-                <w:szCs w:val="22"/>
-                <w:lang w:val="en-PH" w:eastAsia="en-PH"/>
-              </w:rPr>
-              <w:t>}</w:t>
+              <w:t>{Reputation_Satisfactory}</w:t>
             </w:r>
             <w:r>
               <w:rPr>
@@ -7680,27 +6944,7 @@
                 <w:szCs w:val="22"/>
                 <w:lang w:val="en-PH" w:eastAsia="en-PH"/>
               </w:rPr>
-              <w:t>{</w:t>
-            </w:r>
-            <w:proofErr w:type="spellStart"/>
-            <w:r>
-              <w:rPr>
-                <w:rFonts w:ascii="Arial" w:hAnsi="Arial" w:cs="Arial"/>
-                <w:sz w:val="22"/>
-                <w:szCs w:val="22"/>
-                <w:lang w:val="en-PH" w:eastAsia="en-PH"/>
-              </w:rPr>
-              <w:t>Relationship_Poor</w:t>
-            </w:r>
-            <w:proofErr w:type="spellEnd"/>
-            <w:r>
-              <w:rPr>
-                <w:rFonts w:ascii="Arial" w:hAnsi="Arial" w:cs="Arial"/>
-                <w:sz w:val="22"/>
-                <w:szCs w:val="22"/>
-                <w:lang w:val="en-PH" w:eastAsia="en-PH"/>
-              </w:rPr>
-              <w:t>}</w:t>
+              <w:t>{Relationship_Poor}</w:t>
             </w:r>
             <w:r>
               <w:rPr>
@@ -7791,27 +7035,7 @@
                 <w:szCs w:val="22"/>
                 <w:lang w:val="en-PH" w:eastAsia="en-PH"/>
               </w:rPr>
-              <w:t>{</w:t>
-            </w:r>
-            <w:proofErr w:type="spellStart"/>
-            <w:r>
-              <w:rPr>
-                <w:rFonts w:ascii="Arial" w:hAnsi="Arial" w:cs="Arial"/>
-                <w:sz w:val="22"/>
-                <w:szCs w:val="22"/>
-                <w:lang w:val="en-PH" w:eastAsia="en-PH"/>
-              </w:rPr>
-              <w:t>Reputation_Poor</w:t>
-            </w:r>
-            <w:proofErr w:type="spellEnd"/>
-            <w:r>
-              <w:rPr>
-                <w:rFonts w:ascii="Arial" w:hAnsi="Arial" w:cs="Arial"/>
-                <w:sz w:val="22"/>
-                <w:szCs w:val="22"/>
-                <w:lang w:val="en-PH" w:eastAsia="en-PH"/>
-              </w:rPr>
-              <w:t>}</w:t>
+              <w:t>{Reputation_Poor}</w:t>
             </w:r>
             <w:r>
               <w:rPr>
@@ -7936,17 +7160,7 @@
                 <w:szCs w:val="22"/>
                 <w:lang w:val="en-PH" w:eastAsia="en-PH"/>
               </w:rPr>
-              <w:t>{</w:t>
-            </w:r>
-            <w:proofErr w:type="spellStart"/>
-            <w:r>
-              <w:rPr>
-                <w:rFonts w:ascii="Arial" w:hAnsi="Arial" w:cs="Arial"/>
-                <w:sz w:val="22"/>
-                <w:szCs w:val="22"/>
-                <w:lang w:val="en-PH" w:eastAsia="en-PH"/>
-              </w:rPr>
-              <w:t>Status_</w:t>
+              <w:t>{Status_</w:t>
             </w:r>
             <w:r>
               <w:rPr>
@@ -7957,7 +7171,6 @@
               </w:rPr>
               <w:t>Low_Middle</w:t>
             </w:r>
-            <w:proofErr w:type="spellEnd"/>
             <w:r>
               <w:rPr>
                 <w:rFonts w:ascii="Arial" w:hAnsi="Arial" w:cs="Arial"/>
@@ -8244,17 +7457,7 @@
                 <w:szCs w:val="22"/>
                 <w:lang w:val="en-PH" w:eastAsia="en-PH"/>
               </w:rPr>
-              <w:t>{</w:t>
-            </w:r>
-            <w:proofErr w:type="spellStart"/>
-            <w:r>
-              <w:rPr>
-                <w:rFonts w:ascii="Arial" w:hAnsi="Arial" w:cs="Arial"/>
-                <w:sz w:val="22"/>
-                <w:szCs w:val="22"/>
-                <w:lang w:val="en-PH" w:eastAsia="en-PH"/>
-              </w:rPr>
-              <w:t>Status_</w:t>
+              <w:t>{Status_</w:t>
             </w:r>
             <w:r>
               <w:rPr>
@@ -8265,7 +7468,6 @@
               </w:rPr>
               <w:t>Middle_Middle</w:t>
             </w:r>
-            <w:proofErr w:type="spellEnd"/>
             <w:r>
               <w:rPr>
                 <w:rFonts w:ascii="Arial" w:hAnsi="Arial" w:cs="Arial"/>
@@ -8573,17 +7775,7 @@
                 <w:szCs w:val="22"/>
                 <w:lang w:val="en-PH" w:eastAsia="en-PH"/>
               </w:rPr>
-              <w:t>{</w:t>
-            </w:r>
-            <w:proofErr w:type="spellStart"/>
-            <w:r>
-              <w:rPr>
-                <w:rFonts w:ascii="Arial" w:hAnsi="Arial" w:cs="Arial"/>
-                <w:sz w:val="22"/>
-                <w:szCs w:val="22"/>
-                <w:lang w:val="en-PH" w:eastAsia="en-PH"/>
-              </w:rPr>
-              <w:t>Status_</w:t>
+              <w:t>{Status_</w:t>
             </w:r>
             <w:r>
               <w:rPr>
@@ -8594,7 +7786,6 @@
               </w:rPr>
               <w:t>Upper_Middle</w:t>
             </w:r>
-            <w:proofErr w:type="spellEnd"/>
             <w:r>
               <w:rPr>
                 <w:rFonts w:ascii="Arial" w:hAnsi="Arial" w:cs="Arial"/>
@@ -8901,38 +8092,17 @@
                 <w:szCs w:val="22"/>
                 <w:lang w:val="en-PH" w:eastAsia="en-PH"/>
               </w:rPr>
-              <w:t>{</w:t>
-            </w:r>
-            <w:proofErr w:type="spellStart"/>
-            <w:r>
-              <w:rPr>
-                <w:rFonts w:ascii="Arial" w:hAnsi="Arial" w:cs="Arial"/>
-                <w:sz w:val="22"/>
-                <w:szCs w:val="22"/>
-                <w:lang w:val="en-PH" w:eastAsia="en-PH"/>
-              </w:rPr>
-              <w:t>Status_</w:t>
-            </w:r>
-            <w:r>
-              <w:rPr>
-                <w:rFonts w:ascii="Arial" w:hAnsi="Arial" w:cs="Arial"/>
-                <w:sz w:val="22"/>
-                <w:szCs w:val="22"/>
-                <w:lang w:val="en-PH" w:eastAsia="en-PH"/>
-              </w:rPr>
-              <w:t>Upper_</w:t>
-            </w:r>
-            <w:proofErr w:type="gramStart"/>
-            <w:r>
-              <w:rPr>
-                <w:rFonts w:ascii="Arial" w:hAnsi="Arial" w:cs="Arial"/>
-                <w:sz w:val="22"/>
-                <w:szCs w:val="22"/>
-                <w:lang w:val="en-PH" w:eastAsia="en-PH"/>
-              </w:rPr>
-              <w:t>Income</w:t>
-            </w:r>
-            <w:proofErr w:type="spellEnd"/>
+              <w:t>{Status_</w:t>
+            </w:r>
+            <w:r>
+              <w:rPr>
+                <w:rFonts w:ascii="Arial" w:hAnsi="Arial" w:cs="Arial"/>
+                <w:sz w:val="22"/>
+                <w:szCs w:val="22"/>
+                <w:lang w:val="en-PH" w:eastAsia="en-PH"/>
+              </w:rPr>
+              <w:t>Upper_Income</w:t>
+            </w:r>
             <w:r>
               <w:rPr>
                 <w:rFonts w:ascii="Arial" w:hAnsi="Arial" w:cs="Arial"/>
@@ -8949,17 +8119,7 @@
                 <w:szCs w:val="22"/>
                 <w:lang w:val="en-PH" w:eastAsia="en-PH"/>
               </w:rPr>
-              <w:t>Upper</w:t>
-            </w:r>
-            <w:proofErr w:type="gramEnd"/>
-            <w:r>
-              <w:rPr>
-                <w:rFonts w:ascii="Arial" w:hAnsi="Arial" w:cs="Arial"/>
-                <w:sz w:val="22"/>
-                <w:szCs w:val="22"/>
-                <w:lang w:val="en-PH" w:eastAsia="en-PH"/>
-              </w:rPr>
-              <w:t xml:space="preserve">-income Class (but </w:t>
+              <w:t xml:space="preserve">Upper-income Class (but </w:t>
             </w:r>
           </w:p>
           <w:p>
@@ -9239,17 +8399,7 @@
                 <w:szCs w:val="22"/>
                 <w:lang w:val="en-PH" w:eastAsia="en-PH"/>
               </w:rPr>
-              <w:t>{</w:t>
-            </w:r>
-            <w:proofErr w:type="spellStart"/>
-            <w:r>
-              <w:rPr>
-                <w:rFonts w:ascii="Arial" w:hAnsi="Arial" w:cs="Arial"/>
-                <w:sz w:val="22"/>
-                <w:szCs w:val="22"/>
-                <w:lang w:val="en-PH" w:eastAsia="en-PH"/>
-              </w:rPr>
-              <w:t>Status_</w:t>
+              <w:t>{Status_</w:t>
             </w:r>
             <w:r>
               <w:rPr>
@@ -9260,7 +8410,6 @@
               </w:rPr>
               <w:t>Rich</w:t>
             </w:r>
-            <w:proofErr w:type="spellEnd"/>
             <w:r>
               <w:rPr>
                 <w:rFonts w:ascii="Arial" w:hAnsi="Arial" w:cs="Arial"/>
@@ -10152,27 +9301,7 @@
                 <w:szCs w:val="22"/>
                 <w:lang w:val="en-PH" w:eastAsia="en-PH"/>
               </w:rPr>
-              <w:t>{</w:t>
-            </w:r>
-            <w:proofErr w:type="spellStart"/>
-            <w:r>
-              <w:rPr>
-                <w:rFonts w:ascii="Arial" w:hAnsi="Arial" w:cs="Arial"/>
-                <w:sz w:val="22"/>
-                <w:szCs w:val="22"/>
-                <w:lang w:val="en-PH" w:eastAsia="en-PH"/>
-              </w:rPr>
-              <w:t>Support_Very_Satisfactory</w:t>
-            </w:r>
-            <w:proofErr w:type="spellEnd"/>
-            <w:r>
-              <w:rPr>
-                <w:rFonts w:ascii="Arial" w:hAnsi="Arial" w:cs="Arial"/>
-                <w:sz w:val="22"/>
-                <w:szCs w:val="22"/>
-                <w:lang w:val="en-PH" w:eastAsia="en-PH"/>
-              </w:rPr>
-              <w:t>}</w:t>
+              <w:t>{Support_Very_Satisfactory}</w:t>
             </w:r>
             <w:r>
               <w:rPr>
@@ -10291,27 +9420,7 @@
                 <w:szCs w:val="22"/>
                 <w:lang w:val="en-PH" w:eastAsia="en-PH"/>
               </w:rPr>
-              <w:t>{</w:t>
-            </w:r>
-            <w:proofErr w:type="spellStart"/>
-            <w:r>
-              <w:rPr>
-                <w:rFonts w:ascii="Arial" w:hAnsi="Arial" w:cs="Arial"/>
-                <w:sz w:val="22"/>
-                <w:szCs w:val="22"/>
-                <w:lang w:val="en-PH" w:eastAsia="en-PH"/>
-              </w:rPr>
-              <w:t>Community_Very_Satisfactory</w:t>
-            </w:r>
-            <w:proofErr w:type="spellEnd"/>
-            <w:r>
-              <w:rPr>
-                <w:rFonts w:ascii="Arial" w:hAnsi="Arial" w:cs="Arial"/>
-                <w:sz w:val="22"/>
-                <w:szCs w:val="22"/>
-                <w:lang w:val="en-PH" w:eastAsia="en-PH"/>
-              </w:rPr>
-              <w:t>}</w:t>
+              <w:t>{Community_Very_Satisfactory}</w:t>
             </w:r>
             <w:r>
               <w:rPr>
@@ -10407,27 +9516,7 @@
                 <w:szCs w:val="22"/>
                 <w:lang w:val="en-PH" w:eastAsia="en-PH"/>
               </w:rPr>
-              <w:t>{</w:t>
-            </w:r>
-            <w:proofErr w:type="spellStart"/>
-            <w:r>
-              <w:rPr>
-                <w:rFonts w:ascii="Arial" w:hAnsi="Arial" w:cs="Arial"/>
-                <w:sz w:val="22"/>
-                <w:szCs w:val="22"/>
-                <w:lang w:val="en-PH" w:eastAsia="en-PH"/>
-              </w:rPr>
-              <w:t>WellBeing_Very_Satisfactory</w:t>
-            </w:r>
-            <w:proofErr w:type="spellEnd"/>
-            <w:r>
-              <w:rPr>
-                <w:rFonts w:ascii="Arial" w:hAnsi="Arial" w:cs="Arial"/>
-                <w:sz w:val="22"/>
-                <w:szCs w:val="22"/>
-                <w:lang w:val="en-PH" w:eastAsia="en-PH"/>
-              </w:rPr>
-              <w:t>}</w:t>
+              <w:t>{WellBeing_Very_Satisfactory}</w:t>
             </w:r>
             <w:r>
               <w:rPr>
@@ -10552,27 +9641,7 @@
                 <w:szCs w:val="22"/>
                 <w:lang w:val="en-PH" w:eastAsia="en-PH"/>
               </w:rPr>
-              <w:t>{</w:t>
-            </w:r>
-            <w:proofErr w:type="spellStart"/>
-            <w:r>
-              <w:rPr>
-                <w:rFonts w:ascii="Arial" w:hAnsi="Arial" w:cs="Arial"/>
-                <w:sz w:val="22"/>
-                <w:szCs w:val="22"/>
-                <w:lang w:val="en-PH" w:eastAsia="en-PH"/>
-              </w:rPr>
-              <w:t>Support_Satisfactory</w:t>
-            </w:r>
-            <w:proofErr w:type="spellEnd"/>
-            <w:r>
-              <w:rPr>
-                <w:rFonts w:ascii="Arial" w:hAnsi="Arial" w:cs="Arial"/>
-                <w:sz w:val="22"/>
-                <w:szCs w:val="22"/>
-                <w:lang w:val="en-PH" w:eastAsia="en-PH"/>
-              </w:rPr>
-              <w:t>}</w:t>
+              <w:t>{Support_Satisfactory}</w:t>
             </w:r>
             <w:r>
               <w:rPr>
@@ -10691,27 +9760,7 @@
                 <w:szCs w:val="22"/>
                 <w:lang w:val="en-PH" w:eastAsia="en-PH"/>
               </w:rPr>
-              <w:t>{</w:t>
-            </w:r>
-            <w:proofErr w:type="spellStart"/>
-            <w:r>
-              <w:rPr>
-                <w:rFonts w:ascii="Arial" w:hAnsi="Arial" w:cs="Arial"/>
-                <w:sz w:val="22"/>
-                <w:szCs w:val="22"/>
-                <w:lang w:val="en-PH" w:eastAsia="en-PH"/>
-              </w:rPr>
-              <w:t>Community_Satisfactory</w:t>
-            </w:r>
-            <w:proofErr w:type="spellEnd"/>
-            <w:r>
-              <w:rPr>
-                <w:rFonts w:ascii="Arial" w:hAnsi="Arial" w:cs="Arial"/>
-                <w:sz w:val="22"/>
-                <w:szCs w:val="22"/>
-                <w:lang w:val="en-PH" w:eastAsia="en-PH"/>
-              </w:rPr>
-              <w:t>}</w:t>
+              <w:t>{Community_Satisfactory}</w:t>
             </w:r>
             <w:r>
               <w:rPr>
@@ -10807,27 +9856,7 @@
                 <w:szCs w:val="22"/>
                 <w:lang w:val="en-PH" w:eastAsia="en-PH"/>
               </w:rPr>
-              <w:t>{</w:t>
-            </w:r>
-            <w:proofErr w:type="spellStart"/>
-            <w:r>
-              <w:rPr>
-                <w:rFonts w:ascii="Arial" w:hAnsi="Arial" w:cs="Arial"/>
-                <w:sz w:val="22"/>
-                <w:szCs w:val="22"/>
-                <w:lang w:val="en-PH" w:eastAsia="en-PH"/>
-              </w:rPr>
-              <w:t>WellBeing_Satisfactory</w:t>
-            </w:r>
-            <w:proofErr w:type="spellEnd"/>
-            <w:r>
-              <w:rPr>
-                <w:rFonts w:ascii="Arial" w:hAnsi="Arial" w:cs="Arial"/>
-                <w:sz w:val="22"/>
-                <w:szCs w:val="22"/>
-                <w:lang w:val="en-PH" w:eastAsia="en-PH"/>
-              </w:rPr>
-              <w:t>}</w:t>
+              <w:t>{WellBeing_Satisfactory}</w:t>
             </w:r>
             <w:r>
               <w:rPr>
@@ -10952,27 +9981,7 @@
                 <w:szCs w:val="22"/>
                 <w:lang w:val="en-PH" w:eastAsia="en-PH"/>
               </w:rPr>
-              <w:t>{</w:t>
-            </w:r>
-            <w:proofErr w:type="spellStart"/>
-            <w:r>
-              <w:rPr>
-                <w:rFonts w:ascii="Arial" w:hAnsi="Arial" w:cs="Arial"/>
-                <w:sz w:val="22"/>
-                <w:szCs w:val="22"/>
-                <w:lang w:val="en-PH" w:eastAsia="en-PH"/>
-              </w:rPr>
-              <w:t>Support_Poor</w:t>
-            </w:r>
-            <w:proofErr w:type="spellEnd"/>
-            <w:r>
-              <w:rPr>
-                <w:rFonts w:ascii="Arial" w:hAnsi="Arial" w:cs="Arial"/>
-                <w:sz w:val="22"/>
-                <w:szCs w:val="22"/>
-                <w:lang w:val="en-PH" w:eastAsia="en-PH"/>
-              </w:rPr>
-              <w:t>}</w:t>
+              <w:t>{Support_Poor}</w:t>
             </w:r>
             <w:r>
               <w:rPr>
@@ -11091,27 +10100,7 @@
                 <w:szCs w:val="22"/>
                 <w:lang w:val="en-PH" w:eastAsia="en-PH"/>
               </w:rPr>
-              <w:t>{</w:t>
-            </w:r>
-            <w:proofErr w:type="spellStart"/>
-            <w:r>
-              <w:rPr>
-                <w:rFonts w:ascii="Arial" w:hAnsi="Arial" w:cs="Arial"/>
-                <w:sz w:val="22"/>
-                <w:szCs w:val="22"/>
-                <w:lang w:val="en-PH" w:eastAsia="en-PH"/>
-              </w:rPr>
-              <w:t>Community_Poor</w:t>
-            </w:r>
-            <w:proofErr w:type="spellEnd"/>
-            <w:r>
-              <w:rPr>
-                <w:rFonts w:ascii="Arial" w:hAnsi="Arial" w:cs="Arial"/>
-                <w:sz w:val="22"/>
-                <w:szCs w:val="22"/>
-                <w:lang w:val="en-PH" w:eastAsia="en-PH"/>
-              </w:rPr>
-              <w:t>}</w:t>
+              <w:t>{Community_Poor}</w:t>
             </w:r>
             <w:r>
               <w:rPr>
@@ -11207,27 +10196,7 @@
                 <w:szCs w:val="22"/>
                 <w:lang w:val="en-PH" w:eastAsia="en-PH"/>
               </w:rPr>
-              <w:t>{</w:t>
-            </w:r>
-            <w:proofErr w:type="spellStart"/>
-            <w:r>
-              <w:rPr>
-                <w:rFonts w:ascii="Arial" w:hAnsi="Arial" w:cs="Arial"/>
-                <w:sz w:val="22"/>
-                <w:szCs w:val="22"/>
-                <w:lang w:val="en-PH" w:eastAsia="en-PH"/>
-              </w:rPr>
-              <w:t>WellBeing_Poor</w:t>
-            </w:r>
-            <w:proofErr w:type="spellEnd"/>
-            <w:r>
-              <w:rPr>
-                <w:rFonts w:ascii="Arial" w:hAnsi="Arial" w:cs="Arial"/>
-                <w:sz w:val="22"/>
-                <w:szCs w:val="22"/>
-                <w:lang w:val="en-PH" w:eastAsia="en-PH"/>
-              </w:rPr>
-              <w:t>}</w:t>
+              <w:t>{WellBeing_Poor}</w:t>
             </w:r>
             <w:r>
               <w:rPr>
@@ -11472,25 +10441,7 @@
           <w:sz w:val="21"/>
           <w:szCs w:val="21"/>
         </w:rPr>
-        <w:t xml:space="preserve">Therapeutic Community </w:t>
-      </w:r>
-      <w:proofErr w:type="spellStart"/>
-      <w:r>
-        <w:rPr>
-          <w:rFonts w:ascii="Arial" w:hAnsi="Arial" w:cs="Arial"/>
-          <w:sz w:val="21"/>
-          <w:szCs w:val="21"/>
-        </w:rPr>
-        <w:t>Ladderized</w:t>
-      </w:r>
-      <w:proofErr w:type="spellEnd"/>
-      <w:r>
-        <w:rPr>
-          <w:rFonts w:ascii="Arial" w:hAnsi="Arial" w:cs="Arial"/>
-          <w:sz w:val="21"/>
-          <w:szCs w:val="21"/>
-        </w:rPr>
-        <w:t xml:space="preserve"> Program; and/or</w:t>
+        <w:t>Therapeutic Community Ladderized Program; and/or</w:t>
       </w:r>
     </w:p>
     <w:p>
@@ -11604,47 +10555,7 @@
           <w:sz w:val="22"/>
           <w:szCs w:val="22"/>
         </w:rPr>
-        <w:t>{</w:t>
-      </w:r>
-      <w:proofErr w:type="spellStart"/>
-      <w:r>
-        <w:rPr>
-          <w:rFonts w:ascii="Arial" w:hAnsi="Arial" w:cs="Arial"/>
-          <w:b/>
-          <w:sz w:val="22"/>
-          <w:szCs w:val="22"/>
-        </w:rPr>
-        <w:t>Last_Name</w:t>
-      </w:r>
-      <w:proofErr w:type="spellEnd"/>
-      <w:r>
-        <w:rPr>
-          <w:rFonts w:ascii="Arial" w:hAnsi="Arial" w:cs="Arial"/>
-          <w:b/>
-          <w:sz w:val="22"/>
-          <w:szCs w:val="22"/>
-        </w:rPr>
-        <w:t>}, {</w:t>
-      </w:r>
-      <w:proofErr w:type="spellStart"/>
-      <w:r>
-        <w:rPr>
-          <w:rFonts w:ascii="Arial" w:hAnsi="Arial" w:cs="Arial"/>
-          <w:b/>
-          <w:sz w:val="22"/>
-          <w:szCs w:val="22"/>
-        </w:rPr>
-        <w:t>First_Name</w:t>
-      </w:r>
-      <w:proofErr w:type="spellEnd"/>
-      <w:r>
-        <w:rPr>
-          <w:rFonts w:ascii="Arial" w:hAnsi="Arial" w:cs="Arial"/>
-          <w:b/>
-          <w:sz w:val="22"/>
-          <w:szCs w:val="22"/>
-        </w:rPr>
-        <w:t>} {Middle_Name}</w:t>
+        <w:t>{Last_Name}, {First_Name} {Middle_Name}</w:t>
       </w:r>
       <w:r>
         <w:rPr>
@@ -11728,31 +10639,7 @@
           <w:szCs w:val="22"/>
           <w:u w:val="single"/>
         </w:rPr>
-        <w:t>{</w:t>
-      </w:r>
-      <w:proofErr w:type="spellStart"/>
-      <w:r>
-        <w:rPr>
-          <w:rFonts w:ascii="Arial" w:hAnsi="Arial" w:cs="Arial"/>
-          <w:b/>
-          <w:color w:val="000000"/>
-          <w:sz w:val="22"/>
-          <w:szCs w:val="22"/>
-          <w:u w:val="single"/>
-        </w:rPr>
-        <w:t>Probation_Period</w:t>
-      </w:r>
-      <w:proofErr w:type="spellEnd"/>
-      <w:r>
-        <w:rPr>
-          <w:rFonts w:ascii="Arial" w:hAnsi="Arial" w:cs="Arial"/>
-          <w:b/>
-          <w:color w:val="000000"/>
-          <w:sz w:val="22"/>
-          <w:szCs w:val="22"/>
-          <w:u w:val="single"/>
-        </w:rPr>
-        <w:t>}</w:t>
+        <w:t>{Probation_Period}</w:t>
       </w:r>
       <w:r>
         <w:rPr>
@@ -11831,27 +10718,7 @@
           <w:sz w:val="22"/>
           <w:szCs w:val="22"/>
         </w:rPr>
-        <w:t xml:space="preserve"> IBP Building, E.B. </w:t>
-      </w:r>
-      <w:proofErr w:type="spellStart"/>
-      <w:r>
-        <w:rPr>
-          <w:rFonts w:ascii="Arial" w:hAnsi="Arial" w:cs="Arial"/>
-          <w:b/>
-          <w:sz w:val="22"/>
-          <w:szCs w:val="22"/>
-        </w:rPr>
-        <w:t>Aumentado</w:t>
-      </w:r>
-      <w:proofErr w:type="spellEnd"/>
-      <w:r>
-        <w:rPr>
-          <w:rFonts w:ascii="Arial" w:hAnsi="Arial" w:cs="Arial"/>
-          <w:b/>
-          <w:sz w:val="22"/>
-          <w:szCs w:val="22"/>
-        </w:rPr>
-        <w:t xml:space="preserve"> St., Tagbilaran City, Bohol</w:t>
+        <w:t xml:space="preserve"> IBP Building, E.B. Aumentado St., Tagbilaran City, Bohol</w:t>
       </w:r>
       <w:r>
         <w:rPr>
@@ -12050,9 +10917,8 @@
           <w:szCs w:val="22"/>
           <w:lang w:eastAsia="zh-CN"/>
         </w:rPr>
-        <w:t>{</w:t>
+        <w:t>{Community_Service_Hours}</w:t>
       </w:r>
-      <w:proofErr w:type="spellStart"/>
       <w:r>
         <w:rPr>
           <w:rFonts w:ascii="Arial" w:hAnsi="Arial" w:cs="Arial"/>
@@ -12061,9 +10927,8 @@
           <w:szCs w:val="22"/>
           <w:lang w:eastAsia="zh-CN"/>
         </w:rPr>
-        <w:t>Community_Service_Hours</w:t>
+        <w:t xml:space="preserve"> Hours</w:t>
       </w:r>
-      <w:proofErr w:type="spellEnd"/>
       <w:r>
         <w:rPr>
           <w:rFonts w:ascii="Arial" w:hAnsi="Arial" w:cs="Arial"/>
@@ -12072,26 +10937,6 @@
           <w:szCs w:val="22"/>
           <w:lang w:eastAsia="zh-CN"/>
         </w:rPr>
-        <w:t>}</w:t>
-      </w:r>
-      <w:r>
-        <w:rPr>
-          <w:rFonts w:ascii="Arial" w:hAnsi="Arial" w:cs="Arial"/>
-          <w:b/>
-          <w:sz w:val="22"/>
-          <w:szCs w:val="22"/>
-          <w:lang w:eastAsia="zh-CN"/>
-        </w:rPr>
-        <w:t xml:space="preserve"> Hours</w:t>
-      </w:r>
-      <w:r>
-        <w:rPr>
-          <w:rFonts w:ascii="Arial" w:hAnsi="Arial" w:cs="Arial"/>
-          <w:b/>
-          <w:sz w:val="22"/>
-          <w:szCs w:val="22"/>
-          <w:lang w:eastAsia="zh-CN"/>
-        </w:rPr>
         <w:t xml:space="preserve"> </w:t>
       </w:r>
       <w:r>
@@ -12111,29 +10956,7 @@
           <w:szCs w:val="22"/>
           <w:lang w:val="en-AU" w:eastAsia="zh-CN"/>
         </w:rPr>
-        <w:t>{</w:t>
-      </w:r>
-      <w:proofErr w:type="spellStart"/>
-      <w:r>
-        <w:rPr>
-          <w:rFonts w:ascii="Arial" w:hAnsi="Arial" w:cs="Arial"/>
-          <w:b/>
-          <w:sz w:val="22"/>
-          <w:szCs w:val="22"/>
-          <w:lang w:val="en-AU" w:eastAsia="zh-CN"/>
-        </w:rPr>
-        <w:t>Community_Service_Type</w:t>
-      </w:r>
-      <w:proofErr w:type="spellEnd"/>
-      <w:r>
-        <w:rPr>
-          <w:rFonts w:ascii="Arial" w:hAnsi="Arial" w:cs="Arial"/>
-          <w:b/>
-          <w:sz w:val="22"/>
-          <w:szCs w:val="22"/>
-          <w:lang w:val="en-AU" w:eastAsia="zh-CN"/>
-        </w:rPr>
-        <w:t>}</w:t>
+        <w:t>{Community_Service_Type}</w:t>
       </w:r>
       <w:r>
         <w:rPr>
@@ -12254,25 +11077,7 @@
           <w:sz w:val="22"/>
           <w:szCs w:val="22"/>
         </w:rPr>
-        <w:t xml:space="preserve">He shall participate in the Training on Therapeutic Community </w:t>
-      </w:r>
-      <w:proofErr w:type="spellStart"/>
-      <w:r>
-        <w:rPr>
-          <w:rFonts w:ascii="Arial" w:hAnsi="Arial" w:cs="Arial"/>
-          <w:sz w:val="22"/>
-          <w:szCs w:val="22"/>
-        </w:rPr>
-        <w:t>Ladderized</w:t>
-      </w:r>
-      <w:proofErr w:type="spellEnd"/>
-      <w:r>
-        <w:rPr>
-          <w:rFonts w:ascii="Arial" w:hAnsi="Arial" w:cs="Arial"/>
-          <w:sz w:val="22"/>
-          <w:szCs w:val="22"/>
-        </w:rPr>
-        <w:t xml:space="preserve"> Program;</w:t>
+        <w:t>He shall participate in the Training on Therapeutic Community Ladderized Program;</w:t>
       </w:r>
     </w:p>
     <w:p>
@@ -12583,29 +11388,7 @@
                 <w:szCs w:val="22"/>
                 <w:u w:val="single"/>
               </w:rPr>
-              <w:t>{</w:t>
-            </w:r>
-            <w:proofErr w:type="spellStart"/>
-            <w:r>
-              <w:rPr>
-                <w:rFonts w:ascii="Arial" w:hAnsi="Arial" w:cs="Arial"/>
-                <w:b/>
-                <w:sz w:val="22"/>
-                <w:szCs w:val="22"/>
-                <w:u w:val="single"/>
-              </w:rPr>
-              <w:t>Prepared_By_Name</w:t>
-            </w:r>
-            <w:proofErr w:type="spellEnd"/>
-            <w:r>
-              <w:rPr>
-                <w:rFonts w:ascii="Arial" w:hAnsi="Arial" w:cs="Arial"/>
-                <w:b/>
-                <w:sz w:val="22"/>
-                <w:szCs w:val="22"/>
-                <w:u w:val="single"/>
-              </w:rPr>
-              <w:t>}</w:t>
+              <w:t>{Prepared_By_Name}</w:t>
             </w:r>
           </w:p>
         </w:tc>
@@ -12648,33 +11431,7 @@
                 <w:u w:val="single"/>
                 <w:lang w:eastAsia="zh-CN"/>
               </w:rPr>
-              <w:t>{</w:t>
-            </w:r>
-            <w:proofErr w:type="spellStart"/>
-            <w:r>
-              <w:rPr>
-                <w:rFonts w:ascii="Arial" w:hAnsi="Arial" w:cs="Arial"/>
-                <w:b/>
-                <w:bCs/>
-                <w:sz w:val="22"/>
-                <w:szCs w:val="22"/>
-                <w:u w:val="single"/>
-                <w:lang w:eastAsia="zh-CN"/>
-              </w:rPr>
-              <w:t>Reviewed_By_Name</w:t>
-            </w:r>
-            <w:proofErr w:type="spellEnd"/>
-            <w:r>
-              <w:rPr>
-                <w:rFonts w:ascii="Arial" w:hAnsi="Arial" w:cs="Arial"/>
-                <w:b/>
-                <w:bCs/>
-                <w:sz w:val="22"/>
-                <w:szCs w:val="22"/>
-                <w:u w:val="single"/>
-                <w:lang w:eastAsia="zh-CN"/>
-              </w:rPr>
-              <w:t>}</w:t>
+              <w:t>{Reviewed_By_Name}</w:t>
             </w:r>
           </w:p>
         </w:tc>
@@ -12701,25 +11458,7 @@
                 <w:sz w:val="22"/>
                 <w:szCs w:val="22"/>
               </w:rPr>
-              <w:t>{</w:t>
-            </w:r>
-            <w:proofErr w:type="spellStart"/>
-            <w:r>
-              <w:rPr>
-                <w:rFonts w:ascii="Arial" w:hAnsi="Arial" w:cs="Arial"/>
-                <w:sz w:val="22"/>
-                <w:szCs w:val="22"/>
-              </w:rPr>
-              <w:t>Prepared_By_Designation</w:t>
-            </w:r>
-            <w:proofErr w:type="spellEnd"/>
-            <w:r>
-              <w:rPr>
-                <w:rFonts w:ascii="Arial" w:hAnsi="Arial" w:cs="Arial"/>
-                <w:sz w:val="22"/>
-                <w:szCs w:val="22"/>
-              </w:rPr>
-              <w:t>}</w:t>
+              <w:t>{Prepared_By_Designation}</w:t>
             </w:r>
           </w:p>
         </w:tc>
@@ -12751,25 +11490,7 @@
                 <w:sz w:val="22"/>
                 <w:szCs w:val="22"/>
               </w:rPr>
-              <w:t>{</w:t>
-            </w:r>
-            <w:proofErr w:type="spellStart"/>
-            <w:r>
-              <w:rPr>
-                <w:rFonts w:ascii="Arial" w:hAnsi="Arial" w:cs="Arial"/>
-                <w:sz w:val="22"/>
-                <w:szCs w:val="22"/>
-              </w:rPr>
-              <w:t>Reviewed_By_Designation</w:t>
-            </w:r>
-            <w:proofErr w:type="spellEnd"/>
-            <w:r>
-              <w:rPr>
-                <w:rFonts w:ascii="Arial" w:hAnsi="Arial" w:cs="Arial"/>
-                <w:sz w:val="22"/>
-                <w:szCs w:val="22"/>
-              </w:rPr>
-              <w:t>}</w:t>
+              <w:t>{Reviewed_By_Designation}</w:t>
             </w:r>
           </w:p>
         </w:tc>
@@ -12808,7 +11529,6 @@
               </w:rPr>
               <w:t>{</w:t>
             </w:r>
-            <w:proofErr w:type="spellStart"/>
             <w:r>
               <w:rPr>
                 <w:rFonts w:ascii="Arial" w:hAnsi="Arial" w:cs="Arial"/>
@@ -12816,17 +11536,7 @@
                 <w:sz w:val="22"/>
                 <w:szCs w:val="22"/>
               </w:rPr>
-              <w:t>Prepared_By_Date</w:t>
-            </w:r>
-            <w:proofErr w:type="spellEnd"/>
-            <w:r>
-              <w:rPr>
-                <w:rFonts w:ascii="Arial" w:hAnsi="Arial" w:cs="Arial"/>
-                <w:noProof/>
-                <w:sz w:val="22"/>
-                <w:szCs w:val="22"/>
-              </w:rPr>
-              <w:t>}</w:t>
+              <w:t>Prepared_By_Date}</w:t>
             </w:r>
           </w:p>
         </w:tc>
@@ -12873,10 +11583,10 @@
     <w:p>
       <w:pPr>
         <w:sectPr>
-          <w:headerReference w:type="default" r:id="rId15"/>
-          <w:footerReference w:type="default" r:id="rId16"/>
-          <w:headerReference w:type="first" r:id="rId17"/>
-          <w:footerReference w:type="first" r:id="rId18"/>
+          <w:headerReference w:type="default" r:id="rId14"/>
+          <w:footerReference w:type="default" r:id="rId15"/>
+          <w:headerReference w:type="first" r:id="rId16"/>
+          <w:footerReference w:type="first" r:id="rId17"/>
           <w:pgSz w:w="12242" w:h="18728" w:code="5"/>
           <w:pgMar w:top="1440" w:right="1080" w:bottom="1166" w:left="1080" w:header="446" w:footer="706" w:gutter="0"/>
           <w:pgNumType w:start="0"/>
@@ -12888,10 +11598,10 @@
     </w:p>
     <w:p/>
     <w:sectPr>
-      <w:headerReference w:type="default" r:id="rId19"/>
-      <w:footerReference w:type="default" r:id="rId20"/>
-      <w:headerReference w:type="first" r:id="rId21"/>
-      <w:footerReference w:type="first" r:id="rId22"/>
+      <w:headerReference w:type="default" r:id="rId18"/>
+      <w:footerReference w:type="default" r:id="rId19"/>
+      <w:headerReference w:type="first" r:id="rId20"/>
+      <w:footerReference w:type="first" r:id="rId21"/>
       <w:type w:val="continuous"/>
       <w:pgSz w:w="12242" w:h="18728" w:code="5"/>
       <w:pgMar w:top="1440" w:right="1080" w:bottom="1170" w:left="1080" w:header="450" w:footer="709" w:gutter="0"/>
@@ -13768,47 +12478,7 @@
         <w:szCs w:val="24"/>
         <w:lang w:val="en-PH"/>
       </w:rPr>
-      <w:t>{</w:t>
-    </w:r>
-    <w:proofErr w:type="spellStart"/>
-    <w:r>
-      <w:rPr>
-        <w:rFonts w:ascii="Arial" w:hAnsi="Arial" w:cs="Arial"/>
-        <w:sz w:val="22"/>
-        <w:szCs w:val="24"/>
-        <w:lang w:val="en-PH"/>
-      </w:rPr>
-      <w:t>Last_Name</w:t>
-    </w:r>
-    <w:proofErr w:type="spellEnd"/>
-    <w:r>
-      <w:rPr>
-        <w:rFonts w:ascii="Arial" w:hAnsi="Arial" w:cs="Arial"/>
-        <w:sz w:val="22"/>
-        <w:szCs w:val="24"/>
-        <w:lang w:val="en-PH"/>
-      </w:rPr>
-      <w:t>}, {</w:t>
-    </w:r>
-    <w:proofErr w:type="spellStart"/>
-    <w:r>
-      <w:rPr>
-        <w:rFonts w:ascii="Arial" w:hAnsi="Arial" w:cs="Arial"/>
-        <w:sz w:val="22"/>
-        <w:szCs w:val="24"/>
-        <w:lang w:val="en-PH"/>
-      </w:rPr>
-      <w:t>First_Name</w:t>
-    </w:r>
-    <w:proofErr w:type="spellEnd"/>
-    <w:r>
-      <w:rPr>
-        <w:rFonts w:ascii="Arial" w:hAnsi="Arial" w:cs="Arial"/>
-        <w:sz w:val="22"/>
-        <w:szCs w:val="24"/>
-        <w:lang w:val="en-PH"/>
-      </w:rPr>
-      <w:t>}</w:t>
+      <w:t>{Last_Name}, {First_Name}</w:t>
     </w:r>
     <w:r>
       <w:rPr>
@@ -13817,17 +12487,7 @@
         <w:szCs w:val="24"/>
         <w:lang w:val="en-PH"/>
       </w:rPr>
-      <w:t xml:space="preserve"> {Middle_</w:t>
-    </w:r>
-    <w:proofErr w:type="gramStart"/>
-    <w:r>
-      <w:rPr>
-        <w:rFonts w:ascii="Arial" w:hAnsi="Arial" w:cs="Arial"/>
-        <w:sz w:val="22"/>
-        <w:szCs w:val="24"/>
-        <w:lang w:val="en-PH"/>
-      </w:rPr>
-      <w:t>Name}</w:t>
+      <w:t xml:space="preserve"> {Middle_Name}</w:t>
     </w:r>
     <w:r>
       <w:rPr>
@@ -13836,17 +12496,7 @@
         <w:szCs w:val="24"/>
         <w:lang w:val="en-PH"/>
       </w:rPr>
-      <w:t xml:space="preserve">   </w:t>
-    </w:r>
-    <w:proofErr w:type="gramEnd"/>
-    <w:r>
-      <w:rPr>
-        <w:rFonts w:ascii="Arial" w:hAnsi="Arial" w:cs="Arial"/>
-        <w:sz w:val="22"/>
-        <w:szCs w:val="24"/>
-        <w:lang w:val="en-PH"/>
-      </w:rPr>
-      <w:t xml:space="preserve"> </w:t>
+      <w:t xml:space="preserve">    </w:t>
     </w:r>
     <w:r>
       <w:rPr>
@@ -13856,18 +12506,7 @@
         <w:sz w:val="22"/>
         <w:szCs w:val="24"/>
       </w:rPr>
-      <w:t xml:space="preserve">Investigation Docket </w:t>
-    </w:r>
-    <w:proofErr w:type="gramStart"/>
-    <w:r>
-      <w:rPr>
-        <w:rFonts w:ascii="Arial" w:hAnsi="Arial" w:cs="Arial"/>
-        <w:b/>
-        <w:color w:val="000000"/>
-        <w:sz w:val="22"/>
-        <w:szCs w:val="24"/>
-      </w:rPr>
-      <w:t>No.:</w:t>
+      <w:t>Investigation Docket No.:</w:t>
     </w:r>
     <w:r>
       <w:rPr>
@@ -13876,28 +12515,7 @@
         <w:sz w:val="22"/>
         <w:szCs w:val="24"/>
       </w:rPr>
-      <w:t>{</w:t>
-    </w:r>
-    <w:proofErr w:type="spellStart"/>
-    <w:proofErr w:type="gramEnd"/>
-    <w:r>
-      <w:rPr>
-        <w:rFonts w:ascii="Arial" w:hAnsi="Arial" w:cs="Arial"/>
-        <w:color w:val="000000"/>
-        <w:sz w:val="22"/>
-        <w:szCs w:val="24"/>
-      </w:rPr>
-      <w:t>Investigation_Docket_Number</w:t>
-    </w:r>
-    <w:proofErr w:type="spellEnd"/>
-    <w:r>
-      <w:rPr>
-        <w:rFonts w:ascii="Arial" w:hAnsi="Arial" w:cs="Arial"/>
-        <w:color w:val="000000"/>
-        <w:sz w:val="22"/>
-        <w:szCs w:val="24"/>
-      </w:rPr>
-      <w:t>}</w:t>
+      <w:t>{Investigation_Docket_Number}</w:t>
     </w:r>
   </w:p>
   <w:p>
@@ -13931,29 +12549,7 @@
         <w:sz w:val="22"/>
         <w:szCs w:val="24"/>
       </w:rPr>
-      <w:t>{</w:t>
-    </w:r>
-    <w:proofErr w:type="spellStart"/>
-    <w:r>
-      <w:rPr>
-        <w:rFonts w:ascii="Arial" w:hAnsi="Arial" w:cs="Arial"/>
-        <w:bCs/>
-        <w:color w:val="000000"/>
-        <w:sz w:val="22"/>
-        <w:szCs w:val="24"/>
-      </w:rPr>
-      <w:t>Criminal_Case_Number</w:t>
-    </w:r>
-    <w:proofErr w:type="spellEnd"/>
-    <w:r>
-      <w:rPr>
-        <w:rFonts w:ascii="Arial" w:hAnsi="Arial" w:cs="Arial"/>
-        <w:bCs/>
-        <w:color w:val="000000"/>
-        <w:sz w:val="22"/>
-        <w:szCs w:val="24"/>
-      </w:rPr>
-      <w:t>}</w:t>
+      <w:t>{Criminal_Case_Number}</w:t>
     </w:r>
     <w:r>
       <w:rPr>
@@ -14581,7 +13177,7 @@
                                     <pic:cNvPicPr/>
                                   </pic:nvPicPr>
                                   <pic:blipFill>
-                                    <a:blip r:embed="rId6" cstate="print"/>
+                                    <a:blip r:embed="rId1" cstate="print"/>
                                     <a:srcRect/>
                                     <a:stretch/>
                                   </pic:blipFill>
@@ -14611,7 +13207,7 @@
                         </w:rPr>
                         <w:t xml:space="preserve"> </w:t>
                       </w:r>
-                      <w:hyperlink r:id="rId7" w:history="1">
+                      <w:hyperlink r:id="rId6" w:history="1">
                         <w:r>
                           <w:rPr>
                             <w:rStyle w:val="Hyperlink"/>
@@ -14644,7 +13240,7 @@
                         </w:rPr>
                         <w:t xml:space="preserve">Website: </w:t>
                       </w:r>
-                      <w:hyperlink r:id="rId8" w:history="1">
+                      <w:hyperlink r:id="rId7" w:history="1">
                         <w:r>
                           <w:rPr>
                             <w:rFonts w:ascii="Arial" w:hAnsi="Arial" w:cs="Arial"/>
@@ -14688,10 +13284,10 @@
                 <o:lock v:ext="edit" aspectratio="t"/>
               </v:shapetype>
               <v:shape id="Image" o:spid="_x0000_s1034" type="#_x0000_t75" style="position:absolute;left:2232;top:-3101;width:9366;height:9143;visibility:visible;mso-wrap-style:square" o:gfxdata="UEsDBBQABgAIAAAAIQDb4fbL7gAAAIUBAAATAAAAW0NvbnRlbnRfVHlwZXNdLnhtbHyQz07DMAyH&#10;70i8Q+QralM4IITa7kDhCAiNB7ASt43WOlEcyvb2pNu4IODoPz9/n1xv9vOkForiPDdwXVagiI23&#10;jocG3rdPxR0oScgWJ8/UwIEENu3lRb09BBKV0ywNjCmFe63FjDSjlD4Q50nv44wpl3HQAc0OB9I3&#10;VXWrjedEnIq03oC27qjHjympx31un0wiTQLq4bS4shrAECZnMGVTvbD9QSnOhDInjzsyuiBXWQP0&#10;r4R18jfgnHvJr4nOknrFmJ5xzhraRtHWf3Kkpfz/yGo5S+H73hkquyhdjr3R8m2lj09svwAAAP//&#10;AwBQSwMEFAAGAAgAAAAhAFr0LFu/AAAAFQEAAAsAAABfcmVscy8ucmVsc2zPwWrDMAwG4Ptg72B0&#10;X5TuUMaI01uh19I+gLGVxCy2jGSy9e1nemrHjpL4P0nD4SetZiPRyNnCruvBUPYcYp4tXC/Htw8w&#10;Wl0ObuVMFm6kcBhfX4Yzra62kC6xqGlKVgtLreUTUf1CyWnHhXKbTCzJ1VbKjMX5LzcTvvf9HuXR&#10;gPHJNKdgQU5hB+ZyK23zHztFL6w81c5zQp6m6P9TMfB3PtPWFCczVQtB9N4U2rp2HOA44NMz4y8A&#10;AAD//wMAUEsDBBQABgAIAAAAIQDsq2IkwgAAANoAAAAPAAAAZHJzL2Rvd25yZXYueG1sRI/BasMw&#10;EETvhfyD2EBvjdSklOJECSVg8CGX2E5zXaytZWqtjKU47t9XhUKPw8y8YXaH2fViojF0njU8rxQI&#10;4sabjlsNdZU/vYEIEdlg75k0fFOAw37xsMPM+DufaSpjKxKEQ4YabIxDJmVoLDkMKz8QJ+/Tjw5j&#10;kmMrzYj3BHe9XCv1Kh12nBYsDnS01HyVN6cBT6W91Zfry9yf84+qaFXML0rrx+X8vgURaY7/4b92&#10;YTRs4PdKugFy/wMAAP//AwBQSwECLQAUAAYACAAAACEA2+H2y+4AAACFAQAAEwAAAAAAAAAAAAAA&#10;AAAAAAAAW0NvbnRlbnRfVHlwZXNdLnhtbFBLAQItABQABgAIAAAAIQBa9CxbvwAAABUBAAALAAAA&#10;AAAAAAAAAAAAAB8BAABfcmVscy8ucmVsc1BLAQItABQABgAIAAAAIQDsq2IkwgAAANoAAAAPAAAA&#10;AAAAAAAAAAAAAAcCAABkcnMvZG93bnJldi54bWxQSwUGAAAAAAMAAwC3AAAA9gIAAAAA&#10;">
-                <v:imagedata r:id="rId9" o:title=""/>
+                <v:imagedata r:id="rId8" o:title=""/>
               </v:shape>
               <v:shape id="Image" o:spid="_x0000_s1035" type="#_x0000_t75" style="position:absolute;left:54290;top:-3101;width:8903;height:8324;visibility:visible;mso-wrap-style:square" o:gfxdata="UEsDBBQABgAIAAAAIQDb4fbL7gAAAIUBAAATAAAAW0NvbnRlbnRfVHlwZXNdLnhtbHyQz07DMAyH&#10;70i8Q+QralM4IITa7kDhCAiNB7ASt43WOlEcyvb2pNu4IODoPz9/n1xv9vOkForiPDdwXVagiI23&#10;jocG3rdPxR0oScgWJ8/UwIEENu3lRb09BBKV0ywNjCmFe63FjDSjlD4Q50nv44wpl3HQAc0OB9I3&#10;VXWrjedEnIq03oC27qjHjympx31un0wiTQLq4bS4shrAECZnMGVTvbD9QSnOhDInjzsyuiBXWQP0&#10;r4R18jfgnHvJr4nOknrFmJ5xzhraRtHWf3Kkpfz/yGo5S+H73hkquyhdjr3R8m2lj09svwAAAP//&#10;AwBQSwMEFAAGAAgAAAAhAFr0LFu/AAAAFQEAAAsAAABfcmVscy8ucmVsc2zPwWrDMAwG4Ptg72B0&#10;X5TuUMaI01uh19I+gLGVxCy2jGSy9e1nemrHjpL4P0nD4SetZiPRyNnCruvBUPYcYp4tXC/Htw8w&#10;Wl0ObuVMFm6kcBhfX4Yzra62kC6xqGlKVgtLreUTUf1CyWnHhXKbTCzJ1VbKjMX5LzcTvvf9HuXR&#10;gPHJNKdgQU5hB+ZyK23zHztFL6w81c5zQp6m6P9TMfB3PtPWFCczVQtB9N4U2rp2HOA44NMz4y8A&#10;AAD//wMAUEsDBBQABgAIAAAAIQBtkonywQAAANoAAAAPAAAAZHJzL2Rvd25yZXYueG1sRI9Bi8Iw&#10;FITvwv6H8Ba8aVqRVbpGERfRy4JWvT+at22xeQlNttZ/bwTB4zAz3zCLVW8a0VHra8sK0nECgriw&#10;uuZSwfm0Hc1B+ICssbFMCu7kYbX8GCww0/bGR+ryUIoIYZ+hgioEl0npi4oM+rF1xNH7s63BEGVb&#10;St3iLcJNIydJ8iUN1hwXKnS0qai45v9GwSYcOrffzdPZTzq5u5Qvv3p3UWr42a+/QQTqwzv8au+1&#10;gik8r8QbIJcPAAAA//8DAFBLAQItABQABgAIAAAAIQDb4fbL7gAAAIUBAAATAAAAAAAAAAAAAAAA&#10;AAAAAABbQ29udGVudF9UeXBlc10ueG1sUEsBAi0AFAAGAAgAAAAhAFr0LFu/AAAAFQEAAAsAAAAA&#10;AAAAAAAAAAAAHwEAAF9yZWxzLy5yZWxzUEsBAi0AFAAGAAgAAAAhAG2SifLBAAAA2gAAAA8AAAAA&#10;AAAAAAAAAAAABwIAAGRycy9kb3ducmV2LnhtbFBLBQYAAAAAAwADALcAAAD1AgAAAAA=&#10;">
-                <v:imagedata r:id="rId10" o:title=""/>
+                <v:imagedata r:id="rId9" o:title=""/>
               </v:shape>
               <v:line id="Straight Connector 179351327" o:spid="_x0000_s1036" style="position:absolute;visibility:visible;mso-wrap-style:square" from="-1378,8905" to="67015,8905" o:connectortype="straight" o:gfxdata="UEsDBBQABgAIAAAAIQDb4fbL7gAAAIUBAAATAAAAW0NvbnRlbnRfVHlwZXNdLnhtbHyQz07DMAyH&#10;70i8Q+QralM4IITa7kDhCAiNB7ASt43WOlEcyvb2pNu4IODoPz9/n1xv9vOkForiPDdwXVagiI23&#10;jocG3rdPxR0oScgWJ8/UwIEENu3lRb09BBKV0ywNjCmFe63FjDSjlD4Q50nv44wpl3HQAc0OB9I3&#10;VXWrjedEnIq03oC27qjHjympx31un0wiTQLq4bS4shrAECZnMGVTvbD9QSnOhDInjzsyuiBXWQP0&#10;r4R18jfgnHvJr4nOknrFmJ5xzhraRtHWf3Kkpfz/yGo5S+H73hkquyhdjr3R8m2lj09svwAAAP//&#10;AwBQSwMEFAAGAAgAAAAhAFr0LFu/AAAAFQEAAAsAAABfcmVscy8ucmVsc2zPwWrDMAwG4Ptg72B0&#10;X5TuUMaI01uh19I+gLGVxCy2jGSy9e1nemrHjpL4P0nD4SetZiPRyNnCruvBUPYcYp4tXC/Htw8w&#10;Wl0ObuVMFm6kcBhfX4Yzra62kC6xqGlKVgtLreUTUf1CyWnHhXKbTCzJ1VbKjMX5LzcTvvf9HuXR&#10;gPHJNKdgQU5hB+ZyK23zHztFL6w81c5zQp6m6P9TMfB3PtPWFCczVQtB9N4U2rp2HOA44NMz4y8A&#10;AAD//wMAUEsDBBQABgAIAAAAIQA8+XdUxQAAAOIAAAAPAAAAZHJzL2Rvd25yZXYueG1sRE9da8Iw&#10;FH0f+B/CHfg201q12hlFhKFPwroJPl6au6asuSlN1O7fm8Fgj4fzvd4OthU36n3jWEE6SUAQV043&#10;XCv4/Hh7WYLwAVlj65gU/JCH7Wb0tMZCuzu/060MtYgh7AtUYELoCil9Zciin7iOOHJfrrcYIuxr&#10;qXu8x3DbymmSLKTFhmODwY72hqrv8moVDDw/HXbVeZY6nXlzSfJFecqVGj8Pu1cQgYbwL/5zH3Wc&#10;n6+yeZpNc/i9FDHIzQMAAP//AwBQSwECLQAUAAYACAAAACEA2+H2y+4AAACFAQAAEwAAAAAAAAAA&#10;AAAAAAAAAAAAW0NvbnRlbnRfVHlwZXNdLnhtbFBLAQItABQABgAIAAAAIQBa9CxbvwAAABUBAAAL&#10;AAAAAAAAAAAAAAAAAB8BAABfcmVscy8ucmVsc1BLAQItABQABgAIAAAAIQA8+XdUxQAAAOIAAAAP&#10;AAAAAAAAAAAAAAAAAAcCAABkcnMvZG93bnJldi54bWxQSwUGAAAAAAMAAwC3AAAA+QIAAAAA&#10;" strokecolor="#eb613d" strokeweight=".51mm"/>
             </v:group>
@@ -15631,7 +14227,7 @@
                                     <pic:cNvPicPr/>
                                   </pic:nvPicPr>
                                   <pic:blipFill>
-                                    <a:blip r:embed="rId6" cstate="print"/>
+                                    <a:blip r:embed="rId1" cstate="print"/>
                                     <a:srcRect/>
                                     <a:stretch/>
                                   </pic:blipFill>
@@ -15661,7 +14257,7 @@
                         </w:rPr>
                         <w:t xml:space="preserve"> </w:t>
                       </w:r>
-                      <w:hyperlink r:id="rId7" w:history="1">
+                      <w:hyperlink r:id="rId6" w:history="1">
                         <w:r>
                           <w:rPr>
                             <w:rStyle w:val="Hyperlink"/>
@@ -15694,7 +14290,7 @@
                         </w:rPr>
                         <w:t xml:space="preserve">Website: </w:t>
                       </w:r>
-                      <w:hyperlink r:id="rId8" w:history="1">
+                      <w:hyperlink r:id="rId7" w:history="1">
                         <w:r>
                           <w:rPr>
                             <w:rFonts w:ascii="Arial" w:hAnsi="Arial" w:cs="Arial"/>
@@ -15738,10 +14334,10 @@
                 <o:lock v:ext="edit" aspectratio="t"/>
               </v:shapetype>
               <v:shape id="Image" o:spid="_x0000_s1040" type="#_x0000_t75" style="position:absolute;left:2232;top:-3101;width:9366;height:9143;visibility:visible;mso-wrap-style:square" o:gfxdata="UEsDBBQABgAIAAAAIQDb4fbL7gAAAIUBAAATAAAAW0NvbnRlbnRfVHlwZXNdLnhtbHyQz07DMAyH&#10;70i8Q+QralM4IITa7kDhCAiNB7ASt43WOlEcyvb2pNu4IODoPz9/n1xv9vOkForiPDdwXVagiI23&#10;jocG3rdPxR0oScgWJ8/UwIEENu3lRb09BBKV0ywNjCmFe63FjDSjlD4Q50nv44wpl3HQAc0OB9I3&#10;VXWrjedEnIq03oC27qjHjympx31un0wiTQLq4bS4shrAECZnMGVTvbD9QSnOhDInjzsyuiBXWQP0&#10;r4R18jfgnHvJr4nOknrFmJ5xzhraRtHWf3Kkpfz/yGo5S+H73hkquyhdjr3R8m2lj09svwAAAP//&#10;AwBQSwMEFAAGAAgAAAAhAFr0LFu/AAAAFQEAAAsAAABfcmVscy8ucmVsc2zPwWrDMAwG4Ptg72B0&#10;X5TuUMaI01uh19I+gLGVxCy2jGSy9e1nemrHjpL4P0nD4SetZiPRyNnCruvBUPYcYp4tXC/Htw8w&#10;Wl0ObuVMFm6kcBhfX4Yzra62kC6xqGlKVgtLreUTUf1CyWnHhXKbTCzJ1VbKjMX5LzcTvvf9HuXR&#10;gPHJNKdgQU5hB+ZyK23zHztFL6w81c5zQp6m6P9TMfB3PtPWFCczVQtB9N4U2rp2HOA44NMz4y8A&#10;AAD//wMAUEsDBBQABgAIAAAAIQA+vjxdxgAAAOMAAAAPAAAAZHJzL2Rvd25yZXYueG1sRE9LawIx&#10;EL4X+h/CFLzVRNFFt0YphQUPvbi+rsNmulncTJZN1O2/bwqCx/nes9oMrhU36kPjWcNkrEAQV940&#10;XGs47Iv3BYgQkQ22nknDLwXYrF9fVpgbf+cd3cpYixTCIUcNNsYulzJUlhyGse+IE/fje4cxnX0t&#10;TY/3FO5aOVUqkw4bTg0WO/qyVF3Kq9OA36W9Ho7n2dDuitN+W6tYHJXWo7fh8wNEpCE+xQ/31qT5&#10;y2WWzecLNYX/nxIAcv0HAAD//wMAUEsBAi0AFAAGAAgAAAAhANvh9svuAAAAhQEAABMAAAAAAAAA&#10;AAAAAAAAAAAAAFtDb250ZW50X1R5cGVzXS54bWxQSwECLQAUAAYACAAAACEAWvQsW78AAAAVAQAA&#10;CwAAAAAAAAAAAAAAAAAfAQAAX3JlbHMvLnJlbHNQSwECLQAUAAYACAAAACEAPr48XcYAAADjAAAA&#10;DwAAAAAAAAAAAAAAAAAHAgAAZHJzL2Rvd25yZXYueG1sUEsFBgAAAAADAAMAtwAAAPoCAAAAAA==&#10;">
-                <v:imagedata r:id="rId9" o:title=""/>
+                <v:imagedata r:id="rId8" o:title=""/>
               </v:shape>
               <v:shape id="Image" o:spid="_x0000_s1041" type="#_x0000_t75" style="position:absolute;left:54290;top:-3101;width:8903;height:8324;visibility:visible;mso-wrap-style:square" o:gfxdata="UEsDBBQABgAIAAAAIQDb4fbL7gAAAIUBAAATAAAAW0NvbnRlbnRfVHlwZXNdLnhtbHyQz07DMAyH&#10;70i8Q+QralM4IITa7kDhCAiNB7ASt43WOlEcyvb2pNu4IODoPz9/n1xv9vOkForiPDdwXVagiI23&#10;jocG3rdPxR0oScgWJ8/UwIEENu3lRb09BBKV0ywNjCmFe63FjDSjlD4Q50nv44wpl3HQAc0OB9I3&#10;VXWrjedEnIq03oC27qjHjympx31un0wiTQLq4bS4shrAECZnMGVTvbD9QSnOhDInjzsyuiBXWQP0&#10;r4R18jfgnHvJr4nOknrFmJ5xzhraRtHWf3Kkpfz/yGo5S+H73hkquyhdjr3R8m2lj09svwAAAP//&#10;AwBQSwMEFAAGAAgAAAAhAFr0LFu/AAAAFQEAAAsAAABfcmVscy8ucmVsc2zPwWrDMAwG4Ptg72B0&#10;X5TuUMaI01uh19I+gLGVxCy2jGSy9e1nemrHjpL4P0nD4SetZiPRyNnCruvBUPYcYp4tXC/Htw8w&#10;Wl0ObuVMFm6kcBhfX4Yzra62kC6xqGlKVgtLreUTUf1CyWnHhXKbTCzJ1VbKjMX5LzcTvvf9HuXR&#10;gPHJNKdgQU5hB+ZyK23zHztFL6w81c5zQp6m6P9TMfB3PtPWFCczVQtB9N4U2rp2HOA44NMz4y8A&#10;AAD//wMAUEsDBBQABgAIAAAAIQDjAWIeygAAAOMAAAAPAAAAZHJzL2Rvd25yZXYueG1sRI9Bb8Iw&#10;DIXvk/YfIk/abSSpJgYdASEQgsukjY271Zi2onGiJpTy75fDpB3t9/ze58VqdJ0YqI+tZwN6okAQ&#10;V962XBv4+d69zEDEhGyx80wG7hRhtXx8WGBp/Y2/aDimWuQQjiUaaFIKpZSxashhnPhAnLWz7x2m&#10;PPa1tD3ecrjrZKHUVDpsOTc0GGjTUHU5Xp2BTfocwmE/029bXdyD5tOH3Z+MeX4a1+8gEo3p3/x3&#10;fbAZf66m81ddqAydf8oLkMtfAAAA//8DAFBLAQItABQABgAIAAAAIQDb4fbL7gAAAIUBAAATAAAA&#10;AAAAAAAAAAAAAAAAAABbQ29udGVudF9UeXBlc10ueG1sUEsBAi0AFAAGAAgAAAAhAFr0LFu/AAAA&#10;FQEAAAsAAAAAAAAAAAAAAAAAHwEAAF9yZWxzLy5yZWxzUEsBAi0AFAAGAAgAAAAhAOMBYh7KAAAA&#10;4wAAAA8AAAAAAAAAAAAAAAAABwIAAGRycy9kb3ducmV2LnhtbFBLBQYAAAAAAwADALcAAAD+AgAA&#10;AAA=&#10;">
-                <v:imagedata r:id="rId10" o:title=""/>
+                <v:imagedata r:id="rId9" o:title=""/>
               </v:shape>
               <v:line id="Straight Connector 324931324" o:spid="_x0000_s1042" style="position:absolute;visibility:visible;mso-wrap-style:square" from="-1378,8905" to="67015,8905" o:connectortype="straight" o:gfxdata="UEsDBBQABgAIAAAAIQDb4fbL7gAAAIUBAAATAAAAW0NvbnRlbnRfVHlwZXNdLnhtbHyQz07DMAyH&#10;70i8Q+QralM4IITa7kDhCAiNB7ASt43WOlEcyvb2pNu4IODoPz9/n1xv9vOkForiPDdwXVagiI23&#10;jocG3rdPxR0oScgWJ8/UwIEENu3lRb09BBKV0ywNjCmFe63FjDSjlD4Q50nv44wpl3HQAc0OB9I3&#10;VXWrjedEnIq03oC27qjHjympx31un0wiTQLq4bS4shrAECZnMGVTvbD9QSnOhDInjzsyuiBXWQP0&#10;r4R18jfgnHvJr4nOknrFmJ5xzhraRtHWf3Kkpfz/yGo5S+H73hkquyhdjr3R8m2lj09svwAAAP//&#10;AwBQSwMEFAAGAAgAAAAhAFr0LFu/AAAAFQEAAAsAAABfcmVscy8ucmVsc2zPwWrDMAwG4Ptg72B0&#10;X5TuUMaI01uh19I+gLGVxCy2jGSy9e1nemrHjpL4P0nD4SetZiPRyNnCruvBUPYcYp4tXC/Htw8w&#10;Wl0ObuVMFm6kcBhfX4Yzra62kC6xqGlKVgtLreUTUf1CyWnHhXKbTCzJ1VbKjMX5LzcTvvf9HuXR&#10;gPHJNKdgQU5hB+ZyK23zHztFL6w81c5zQp6m6P9TMfB3PtPWFCczVQtB9N4U2rp2HOA44NMz4y8A&#10;AAD//wMAUEsDBBQABgAIAAAAIQCsqbtFxwAAAOIAAAAPAAAAZHJzL2Rvd25yZXYueG1sRE9da8Iw&#10;FH0f+B/CFfY201rnRzWKDMZ8ElYVfLw016bY3JQmavfvF2GwlwOH88VZbXrbiDt1vnasIB0lIIhL&#10;p2uuFBwPn29zED4ga2wck4If8rBZD15WmGv34G+6F6ESsYR9jgpMCG0upS8NWfQj1xJH7eI6iyHS&#10;rpK6w0cst40cJ8lUWqw5Lhhs6cNQeS1uVkHP7/uvbXmapE5n3pyT2bTYz5R6HfbbJYhAffg3/6V3&#10;WkE2niyyNCI8L8U7INe/AAAA//8DAFBLAQItABQABgAIAAAAIQDb4fbL7gAAAIUBAAATAAAAAAAA&#10;AAAAAAAAAAAAAABbQ29udGVudF9UeXBlc10ueG1sUEsBAi0AFAAGAAgAAAAhAFr0LFu/AAAAFQEA&#10;AAsAAAAAAAAAAAAAAAAAHwEAAF9yZWxzLy5yZWxzUEsBAi0AFAAGAAgAAAAhAKypu0XHAAAA4gAA&#10;AA8AAAAAAAAAAAAAAAAABwIAAGRycy9kb3ducmV2LnhtbFBLBQYAAAAAAwADALcAAAD7AgAAAAA=&#10;" strokecolor="#eb613d" strokeweight=".51mm"/>
             </v:group>

</xml_diff>